<commit_message>
made microwave program dynamic in config.ini file
</commit_message>
<xml_diff>
--- a/user_guide/WORKBOOK_CREATOR user guide.docx
+++ b/user_guide/WORKBOOK_CREATOR user guide.docx
@@ -1762,13 +1762,7 @@
         <w:rPr>
           <w:color w:val="FF0000"/>
         </w:rPr>
-        <w:t>) titration analysis</w:t>
-      </w:r>
-      <w:r>
-        <w:rPr>
-          <w:color w:val="FF0000"/>
-        </w:rPr>
-        <w:t xml:space="preserve"> setup.</w:t>
+        <w:t>) titration analysis setup.</w:t>
       </w:r>
     </w:p>
     <w:p>
@@ -2441,6 +2435,26 @@
       <w:r>
         <w:t>provided it defaults to directory that the program is running.</w:t>
       </w:r>
+      <w:r>
+        <w:t xml:space="preserve"> Use &lt;F1&gt; as shortcut to open the </w:t>
+      </w:r>
+      <w:r>
+        <w:rPr>
+          <w:i/>
+          <w:iCs/>
+        </w:rPr>
+        <w:t>config.ini</w:t>
+      </w:r>
+      <w:r>
+        <w:t xml:space="preserve"> configuration file.</w:t>
+      </w:r>
+    </w:p>
+    <w:p>
+      <w:pPr>
+        <w:tabs>
+          <w:tab w:val="left" w:pos="1327"/>
+        </w:tabs>
+      </w:pPr>
     </w:p>
     <w:sectPr>
       <w:headerReference w:type="default" r:id="rId19"/>

</xml_diff>

<commit_message>
current version on sharepoint
</commit_message>
<xml_diff>
--- a/user_guide/WORKBOOK_CREATOR user guide.docx
+++ b/user_guide/WORKBOOK_CREATOR user guide.docx
@@ -1,6 +1,6 @@
 
 <file path=word/document.xml><?xml version="1.0" encoding="utf-8"?>
-<w:document xmlns:wpc="http://schemas.microsoft.com/office/word/2010/wordprocessingCanvas" xmlns:cx="http://schemas.microsoft.com/office/drawing/2014/chartex" xmlns:cx1="http://schemas.microsoft.com/office/drawing/2015/9/8/chartex" xmlns:cx2="http://schemas.microsoft.com/office/drawing/2015/10/21/chartex" xmlns:cx3="http://schemas.microsoft.com/office/drawing/2016/5/9/chartex" xmlns:cx4="http://schemas.microsoft.com/office/drawing/2016/5/10/chartex" xmlns:cx5="http://schemas.microsoft.com/office/drawing/2016/5/11/chartex" xmlns:cx6="http://schemas.microsoft.com/office/drawing/2016/5/12/chartex" xmlns:cx7="http://schemas.microsoft.com/office/drawing/2016/5/13/chartex" xmlns:cx8="http://schemas.microsoft.com/office/drawing/2016/5/14/chartex" xmlns:mc="http://schemas.openxmlformats.org/markup-compatibility/2006" xmlns:aink="http://schemas.microsoft.com/office/drawing/2016/ink" xmlns:am3d="http://schemas.microsoft.com/office/drawing/2017/model3d" xmlns:o="urn:schemas-microsoft-com:office:office" xmlns:oel="http://schemas.microsoft.com/office/2019/extlst" xmlns:r="http://schemas.openxmlformats.org/officeDocument/2006/relationships" xmlns:m="http://schemas.openxmlformats.org/officeDocument/2006/math" xmlns:v="urn:schemas-microsoft-com:vml" xmlns:wp14="http://schemas.microsoft.com/office/word/2010/wordprocessingDrawing" xmlns:wp="http://schemas.openxmlformats.org/drawingml/2006/wordprocessingDrawing" xmlns:w10="urn:schemas-microsoft-com:office:word" xmlns:w="http://schemas.openxmlformats.org/wordprocessingml/2006/main" xmlns:w14="http://schemas.microsoft.com/office/word/2010/wordml" xmlns:w15="http://schemas.microsoft.com/office/word/2012/wordml" xmlns:w16cex="http://schemas.microsoft.com/office/word/2018/wordml/cex" xmlns:w16cid="http://schemas.microsoft.com/office/word/2016/wordml/cid" xmlns:w16="http://schemas.microsoft.com/office/word/2018/wordml" xmlns:w16du="http://schemas.microsoft.com/office/word/2023/wordml/word16du" xmlns:w16sdtdh="http://schemas.microsoft.com/office/word/2020/wordml/sdtdatahash" xmlns:w16sdtfl="http://schemas.microsoft.com/office/word/2024/wordml/sdtformatlock" xmlns:w16se="http://schemas.microsoft.com/office/word/2015/wordml/symex" xmlns:wpg="http://schemas.microsoft.com/office/word/2010/wordprocessingGroup" xmlns:wpi="http://schemas.microsoft.com/office/word/2010/wordprocessingInk" xmlns:wne="http://schemas.microsoft.com/office/word/2006/wordml" xmlns:wps="http://schemas.microsoft.com/office/word/2010/wordprocessingShape" mc:Ignorable="w14 w15 w16se w16cid w16 w16cex w16sdtdh w16sdtfl w16du wp14">
+<w:document xmlns:wpc="http://schemas.microsoft.com/office/word/2010/wordprocessingCanvas" xmlns:cx="http://schemas.microsoft.com/office/drawing/2014/chartex" xmlns:cx1="http://schemas.microsoft.com/office/drawing/2015/9/8/chartex" xmlns:cx2="http://schemas.microsoft.com/office/drawing/2015/10/21/chartex" xmlns:cx3="http://schemas.microsoft.com/office/drawing/2016/5/9/chartex" xmlns:cx4="http://schemas.microsoft.com/office/drawing/2016/5/10/chartex" xmlns:cx5="http://schemas.microsoft.com/office/drawing/2016/5/11/chartex" xmlns:cx6="http://schemas.microsoft.com/office/drawing/2016/5/12/chartex" xmlns:cx7="http://schemas.microsoft.com/office/drawing/2016/5/13/chartex" xmlns:cx8="http://schemas.microsoft.com/office/drawing/2016/5/14/chartex" xmlns:mc="http://schemas.openxmlformats.org/markup-compatibility/2006" xmlns:aink="http://schemas.microsoft.com/office/drawing/2016/ink" xmlns:am3d="http://schemas.microsoft.com/office/drawing/2017/model3d" xmlns:o="urn:schemas-microsoft-com:office:office" xmlns:oel="http://schemas.microsoft.com/office/2019/extlst" xmlns:r="http://schemas.openxmlformats.org/officeDocument/2006/relationships" xmlns:m="http://schemas.openxmlformats.org/officeDocument/2006/math" xmlns:v="urn:schemas-microsoft-com:vml" xmlns:wp14="http://schemas.microsoft.com/office/word/2010/wordprocessingDrawing" xmlns:wp="http://schemas.openxmlformats.org/drawingml/2006/wordprocessingDrawing" xmlns:w10="urn:schemas-microsoft-com:office:word" xmlns:w="http://schemas.openxmlformats.org/wordprocessingml/2006/main" xmlns:w14="http://schemas.microsoft.com/office/word/2010/wordml" xmlns:w15="http://schemas.microsoft.com/office/word/2012/wordml" xmlns:w16cex="http://schemas.microsoft.com/office/word/2018/wordml/cex" xmlns:w16cid="http://schemas.microsoft.com/office/word/2016/wordml/cid" xmlns:w16="http://schemas.microsoft.com/office/word/2018/wordml" xmlns:w16du="http://schemas.microsoft.com/office/word/2023/wordml/word16du" xmlns:w16sdtdh="http://schemas.microsoft.com/office/word/2020/wordml/sdtdatahash" xmlns:w16sdtfl="http://schemas.microsoft.com/office/word/2024/wordml/sdtformatlock" xmlns:w16se="http://schemas.microsoft.com/office/word/2015/wordml/symex" xmlns:wpg="http://schemas.microsoft.com/office/word/2010/wordprocessingGroup" xmlns:wpi="http://schemas.microsoft.com/office/word/2010/wordprocessingInk" xmlns:wne="http://schemas.microsoft.com/office/word/2006/wordml" xmlns:wps="http://schemas.microsoft.com/office/word/2010/wordprocessingShape" xmlns:a="http://schemas.openxmlformats.org/drawingml/2006/main" xmlns:pic="http://schemas.openxmlformats.org/drawingml/2006/picture" xmlns:a14="http://schemas.microsoft.com/office/drawing/2010/main" mc:Ignorable="w14 w15 w16se w16cid w16 w16cex w16sdtdh w16sdtfl w16du wp14">
   <w:body>
     <w:p>
       <w:pPr>
@@ -26,78 +26,112 @@
     </w:p>
     <w:p>
       <w:r>
-        <w:t xml:space="preserve">For this program to work the directory should contain an </w:t>
-      </w:r>
-      <w:r>
-        <w:rPr>
-          <w:i/>
-          <w:iCs/>
-        </w:rPr>
-        <w:t xml:space="preserve">img </w:t>
-      </w:r>
-      <w:r>
+        <w:rPr/>
+        <w:t xml:space="preserve">For this program to </w:t>
+      </w:r>
+      <w:r>
+        <w:rPr/>
+        <w:t>work,</w:t>
+      </w:r>
+      <w:r>
+        <w:rPr/>
+        <w:t xml:space="preserve"> the directory should </w:t>
+      </w:r>
+      <w:r>
+        <w:rPr/>
+        <w:t>contain</w:t>
+      </w:r>
+      <w:r>
+        <w:rPr/>
+        <w:t xml:space="preserve"> an </w:t>
+      </w:r>
+      <w:r>
+        <w:rPr>
+          <w:i w:val="1"/>
+          <w:iCs w:val="1"/>
+        </w:rPr>
+        <w:t>img</w:t>
+      </w:r>
+      <w:r>
+        <w:rPr>
+          <w:i w:val="1"/>
+          <w:iCs w:val="1"/>
+        </w:rPr>
+        <w:t xml:space="preserve"> </w:t>
+      </w:r>
+      <w:r>
+        <w:rPr/>
         <w:t xml:space="preserve">folder with a </w:t>
       </w:r>
       <w:r>
         <w:rPr>
-          <w:i/>
-          <w:iCs/>
+          <w:i w:val="1"/>
+          <w:iCs w:val="1"/>
         </w:rPr>
         <w:t>logo.ico</w:t>
       </w:r>
       <w:r>
+        <w:rPr/>
         <w:t xml:space="preserve"> file, </w:t>
       </w:r>
       <w:r>
+        <w:rPr/>
         <w:t xml:space="preserve">a </w:t>
       </w:r>
       <w:r>
+        <w:rPr/>
         <w:t xml:space="preserve">configuration file titled </w:t>
       </w:r>
       <w:r>
         <w:rPr>
-          <w:i/>
-          <w:iCs/>
+          <w:i w:val="1"/>
+          <w:iCs w:val="1"/>
         </w:rPr>
         <w:t>config.ini</w:t>
       </w:r>
       <w:r>
+        <w:rPr/>
         <w:t>,</w:t>
       </w:r>
       <w:r>
         <w:rPr>
-          <w:i/>
-          <w:iCs/>
+          <w:i w:val="1"/>
+          <w:iCs w:val="1"/>
         </w:rPr>
         <w:t xml:space="preserve"> </w:t>
       </w:r>
       <w:r>
+        <w:rPr/>
         <w:t xml:space="preserve">an optional </w:t>
       </w:r>
       <w:r>
         <w:rPr>
-          <w:i/>
-          <w:iCs/>
+          <w:i w:val="1"/>
+          <w:iCs w:val="1"/>
         </w:rPr>
         <w:t>lot.csv</w:t>
       </w:r>
       <w:r>
+        <w:rPr/>
         <w:t xml:space="preserve"> and the executable </w:t>
       </w:r>
       <w:r>
         <w:rPr>
-          <w:i/>
-          <w:iCs/>
+          <w:i w:val="1"/>
+          <w:iCs w:val="1"/>
         </w:rPr>
         <w:t>WORKBOOK_CREATOR.EXE</w:t>
       </w:r>
       <w:r>
+        <w:rPr/>
         <w:t xml:space="preserve"> file itself.</w:t>
       </w:r>
       <w:r>
+        <w:rPr/>
         <w:t xml:space="preserve"> Launching the application displays the graphical user interface</w:t>
       </w:r>
       <w:r>
+        <w:rPr/>
         <w:t xml:space="preserve"> below:</w:t>
       </w:r>
     </w:p>
@@ -244,19 +278,40 @@
         </w:tabs>
       </w:pPr>
       <w:r>
-        <w:t>You are presented with an interface to input the request id, samples, a check box to apply a L.O.I correction for the analysis and a set of radio buttons to set the samples as duplicate or triplicate.</w:t>
-      </w:r>
-      <w:r>
+        <w:rPr/>
+        <w:t>You are presented with an interface to input the request id, samples</w:t>
+      </w:r>
+      <w:r>
+        <w:rPr/>
+        <w:t>, and a</w:t>
+      </w:r>
+      <w:r>
+        <w:rPr/>
+        <w:t xml:space="preserve"> check box to apply a L.O.I correction for the analysis and a set of radio buttons to set the samples as duplicate or triplicate.</w:t>
+      </w:r>
+      <w:r>
+        <w:rPr/>
         <w:t xml:space="preserve"> After filling out the information about the request</w:t>
       </w:r>
       <w:r>
+        <w:rPr/>
         <w:t>,</w:t>
       </w:r>
       <w:r>
+        <w:rPr/>
         <w:t xml:space="preserve"> you then input the metals analyzed and their respective digestion method.</w:t>
       </w:r>
       <w:r>
-        <w:t xml:space="preserve"> I’ve attached a sample request report to walkthrough building a workbook.</w:t>
+        <w:rPr/>
+        <w:t xml:space="preserve"> </w:t>
+      </w:r>
+      <w:r>
+        <w:rPr/>
+        <w:t>I’ve</w:t>
+      </w:r>
+      <w:r>
+        <w:rPr/>
+        <w:t xml:space="preserve"> attached a sample request report to walkthrough building a workbook.</w:t>
       </w:r>
     </w:p>
     <w:p>
@@ -400,31 +455,100 @@
         </w:tabs>
       </w:pPr>
       <w:r>
-        <w:t>Note that this sample request contains Al2O3, CaO for all 4 samples but only sample 200127536 contains TiO2.</w:t>
-      </w:r>
-      <w:r>
-        <w:t xml:space="preserve"> To build this sheet a separate digestion needs to be created to capture TiO2.</w:t>
-      </w:r>
-      <w:r>
+        <w:rPr/>
+        <w:t xml:space="preserve">Note that this sample request </w:t>
+      </w:r>
+      <w:r>
+        <w:rPr/>
+        <w:t>contains</w:t>
+      </w:r>
+      <w:r>
+        <w:rPr/>
+        <w:t xml:space="preserve"> Al2O3, CaO for all 4 </w:t>
+      </w:r>
+      <w:r>
+        <w:rPr/>
+        <w:t>samples,</w:t>
+      </w:r>
+      <w:r>
+        <w:rPr/>
+        <w:t xml:space="preserve"> but only sample 200127536 </w:t>
+      </w:r>
+      <w:r>
+        <w:rPr/>
+        <w:t>contains</w:t>
+      </w:r>
+      <w:r>
+        <w:rPr/>
+        <w:t xml:space="preserve"> TiO2.</w:t>
+      </w:r>
+      <w:r>
+        <w:rPr/>
+        <w:t xml:space="preserve"> To build this </w:t>
+      </w:r>
+      <w:r>
+        <w:rPr/>
+        <w:t>sheet,</w:t>
+      </w:r>
+      <w:r>
+        <w:rPr/>
+        <w:t xml:space="preserve"> </w:t>
+      </w:r>
+      <w:r>
+        <w:rPr/>
+        <w:t>a separate</w:t>
+      </w:r>
+      <w:r>
+        <w:rPr/>
+        <w:t xml:space="preserve"> digestion needs to be created to capture TiO2.</w:t>
+      </w:r>
+      <w:r>
+        <w:rPr/>
         <w:t xml:space="preserve"> Samples can </w:t>
       </w:r>
       <w:r>
+        <w:rPr/>
         <w:t xml:space="preserve">be </w:t>
       </w:r>
       <w:r>
+        <w:rPr/>
         <w:t>inputted</w:t>
       </w:r>
       <w:r>
-        <w:t xml:space="preserve"> as a comma or white space separated list; I’ve also included a shortcut if all the samples in the analysis are sequential. </w:t>
-      </w:r>
-      <w:r>
-        <w:rPr>
-          <w:i/>
-          <w:iCs/>
-        </w:rPr>
-        <w:t>shortcut=leading_sample_id(n)</w:t>
-      </w:r>
-      <w:r>
+        <w:rPr/>
+        <w:t xml:space="preserve"> as a comma or white space separated list; </w:t>
+      </w:r>
+      <w:r>
+        <w:rPr/>
+        <w:t>I’ve</w:t>
+      </w:r>
+      <w:r>
+        <w:rPr/>
+        <w:t xml:space="preserve"> also included a shortcut if all the samples in the analysis are sequential. </w:t>
+      </w:r>
+      <w:r>
+        <w:rPr>
+          <w:i w:val="1"/>
+          <w:iCs w:val="1"/>
+        </w:rPr>
+        <w:t>shortcut=</w:t>
+      </w:r>
+      <w:r>
+        <w:rPr>
+          <w:i w:val="1"/>
+          <w:iCs w:val="1"/>
+        </w:rPr>
+        <w:t>leading_sample_id</w:t>
+      </w:r>
+      <w:r>
+        <w:rPr>
+          <w:i w:val="1"/>
+          <w:iCs w:val="1"/>
+        </w:rPr>
+        <w:t>(n)</w:t>
+      </w:r>
+      <w:r>
+        <w:rPr/>
         <w:t>, so in our case: 200127533(4) = 200127533, 200127534, 200127535, 200127536.</w:t>
       </w:r>
     </w:p>
@@ -499,40 +623,40 @@
       </w:pPr>
       <w:r>
         <w:rPr>
-          <w:b/>
-          <w:bCs/>
+          <w:b w:val="1"/>
+          <w:bCs w:val="1"/>
           <w:color w:val="FF0000"/>
         </w:rPr>
         <w:t xml:space="preserve">Figure </w:t>
       </w:r>
       <w:r>
         <w:rPr>
-          <w:b/>
-          <w:bCs/>
+          <w:b w:val="1"/>
+          <w:bCs w:val="1"/>
           <w:color w:val="FF0000"/>
         </w:rPr>
         <w:fldChar w:fldCharType="begin"/>
       </w:r>
       <w:r>
         <w:rPr>
-          <w:b/>
-          <w:bCs/>
+          <w:b w:val="1"/>
+          <w:bCs w:val="1"/>
           <w:color w:val="FF0000"/>
         </w:rPr>
         <w:instrText xml:space="preserve"> SEQ Figure \* ARABIC </w:instrText>
       </w:r>
       <w:r>
         <w:rPr>
-          <w:b/>
-          <w:bCs/>
+          <w:b w:val="1"/>
+          <w:bCs w:val="1"/>
           <w:color w:val="FF0000"/>
         </w:rPr>
         <w:fldChar w:fldCharType="separate"/>
       </w:r>
       <w:r>
         <w:rPr>
-          <w:b/>
-          <w:bCs/>
+          <w:b w:val="1"/>
+          <w:bCs w:val="1"/>
           <w:noProof/>
           <w:color w:val="FF0000"/>
         </w:rPr>
@@ -540,16 +664,16 @@
       </w:r>
       <w:r>
         <w:rPr>
-          <w:b/>
-          <w:bCs/>
+          <w:b w:val="1"/>
+          <w:bCs w:val="1"/>
           <w:color w:val="FF0000"/>
         </w:rPr>
         <w:fldChar w:fldCharType="end"/>
       </w:r>
       <w:r>
         <w:rPr>
-          <w:b/>
-          <w:bCs/>
+          <w:b w:val="1"/>
+          <w:bCs w:val="1"/>
           <w:color w:val="FF0000"/>
         </w:rPr>
         <w:t>:</w:t>
@@ -558,7 +682,19 @@
         <w:rPr>
           <w:color w:val="FF0000"/>
         </w:rPr>
-        <w:t xml:space="preserve"> selecting Ti analysis for sample 200127536.</w:t>
+        <w:t xml:space="preserve"> </w:t>
+      </w:r>
+      <w:r>
+        <w:rPr>
+          <w:color w:val="FF0000"/>
+        </w:rPr>
+        <w:t>Selecting</w:t>
+      </w:r>
+      <w:r>
+        <w:rPr>
+          <w:color w:val="FF0000"/>
+        </w:rPr>
+        <w:t xml:space="preserve"> Ti analysis for sample 200127536.</w:t>
       </w:r>
     </w:p>
     <w:p>
@@ -568,40 +704,90 @@
         </w:tabs>
       </w:pPr>
       <w:r>
-        <w:t xml:space="preserve">Note the separate Ti Katanax digestion to capture Ti for sample 200127536, </w:t>
-      </w:r>
-      <w:r>
-        <w:t>all of the other samples are preselected</w:t>
-      </w:r>
-      <w:r>
+        <w:rPr/>
+        <w:t xml:space="preserve">Note the separate Ti </w:t>
+      </w:r>
+      <w:r>
+        <w:rPr/>
+        <w:t>Katanax</w:t>
+      </w:r>
+      <w:r>
+        <w:rPr/>
+        <w:t xml:space="preserve"> digestion to capture Ti for sample </w:t>
+      </w:r>
+      <w:r>
+        <w:rPr/>
+        <w:t>200127536;</w:t>
+      </w:r>
+      <w:r>
+        <w:rPr/>
         <w:t xml:space="preserve"> </w:t>
       </w:r>
       <w:r>
+        <w:rPr/>
+        <w:t>all</w:t>
+      </w:r>
+      <w:r>
+        <w:rPr/>
+        <w:t xml:space="preserve"> the other samples are preselected</w:t>
+      </w:r>
+      <w:r>
+        <w:rPr/>
+        <w:t xml:space="preserve"> </w:t>
+      </w:r>
+      <w:r>
+        <w:rPr/>
         <w:t xml:space="preserve">for the Al, Ca </w:t>
       </w:r>
       <w:r>
-        <w:t>Katanax digestion.</w:t>
-      </w:r>
-      <w:r>
-        <w:t xml:space="preserve"> Once all the pertinent info is put into the application click on the submit button to create </w:t>
-      </w:r>
-      <w:r>
-        <w:rPr>
-          <w:i/>
-          <w:iCs/>
+        <w:rPr/>
+        <w:t>Katanax</w:t>
+      </w:r>
+      <w:r>
+        <w:rPr/>
+        <w:t xml:space="preserve"> digestion.</w:t>
+      </w:r>
+      <w:r>
+        <w:rPr/>
+        <w:t xml:space="preserve"> Once all the pertinent info is put into the </w:t>
+      </w:r>
+      <w:r>
+        <w:rPr/>
+        <w:t>application,</w:t>
+      </w:r>
+      <w:r>
+        <w:rPr/>
+        <w:t xml:space="preserve"> click on the </w:t>
+      </w:r>
+      <w:r>
+        <w:rPr/>
+        <w:t>submit</w:t>
+      </w:r>
+      <w:r>
+        <w:rPr/>
+        <w:t xml:space="preserve"> button to create </w:t>
+      </w:r>
+      <w:r>
+        <w:rPr>
+          <w:i w:val="1"/>
+          <w:iCs w:val="1"/>
         </w:rPr>
         <w:t>master_woorkbook.xlsx</w:t>
       </w:r>
       <w:r>
+        <w:rPr/>
         <w:t>. You are</w:t>
       </w:r>
       <w:r>
+        <w:rPr/>
         <w:t xml:space="preserve"> </w:t>
       </w:r>
       <w:r>
+        <w:rPr/>
         <w:t>then presented</w:t>
       </w:r>
       <w:r>
+        <w:rPr/>
         <w:t xml:space="preserve"> with a workbook with a digestion page and a tab for each of the samples.</w:t>
       </w:r>
     </w:p>
@@ -868,11 +1054,11 @@
           </mc:Choice>
           <mc:Fallback>
             <w:pict>
-              <v:shapetype w14:anchorId="135A8075" id="_x0000_t202" coordsize="21600,21600" o:spt="202" path="m,l,21600r21600,l21600,xe">
+              <v:shapetype id="_x0000_t202" coordsize="21600,21600" o:spt="202" path="m,l,21600r21600,l21600,xe" w14:anchorId="135A8075">
                 <v:stroke joinstyle="miter"/>
                 <v:path gradientshapeok="t" o:connecttype="rect"/>
               </v:shapetype>
-              <v:shape id="Text Box 1" o:spid="_x0000_s1026" type="#_x0000_t202" style="position:absolute;margin-left:266.05pt;margin-top:315.85pt;width:239.05pt;height:.05pt;z-index:251661312;visibility:visible;mso-wrap-style:square;mso-wrap-distance-left:9pt;mso-wrap-distance-top:0;mso-wrap-distance-right:9pt;mso-wrap-distance-bottom:0;mso-position-horizontal:absolute;mso-position-horizontal-relative:text;mso-position-vertical:absolute;mso-position-vertical-relative:text;v-text-anchor:top" o:gfxdata="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" stroked="f">
+              <v:shape id="Text Box 1" style="position:absolute;margin-left:266.05pt;margin-top:315.85pt;width:239.05pt;height:.05pt;z-index:251661312;visibility:visible;mso-wrap-style:square;mso-wrap-distance-left:9pt;mso-wrap-distance-top:0;mso-wrap-distance-right:9pt;mso-wrap-distance-bottom:0;mso-position-horizontal:absolute;mso-position-horizontal-relative:text;mso-position-vertical:absolute;mso-position-vertical-relative:text;v-text-anchor:top" o:spid="_x0000_s1026" stroked="f" type="#_x0000_t202" o:gfxdata="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">
                 <v:textbox style="mso-fit-shape-to-text:t" inset="0,0,0,0">
                   <w:txbxContent>
                     <w:p>
@@ -1060,7 +1246,7 @@
           </mc:Choice>
           <mc:Fallback>
             <w:pict>
-              <v:shape w14:anchorId="5CB2E506" id="_x0000_s1027" type="#_x0000_t202" style="position:absolute;margin-left:251.65pt;margin-top:.3pt;width:248.55pt;height:.05pt;z-index:251663360;visibility:visible;mso-wrap-style:square;mso-width-percent:0;mso-wrap-distance-left:9pt;mso-wrap-distance-top:0;mso-wrap-distance-right:9pt;mso-wrap-distance-bottom:0;mso-position-horizontal:absolute;mso-position-horizontal-relative:text;mso-position-vertical:absolute;mso-position-vertical-relative:text;mso-width-percent:0;mso-width-relative:margin;v-text-anchor:top" o:gfxdata="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" stroked="f">
+              <v:shape id="_x0000_s1027" style="position:absolute;margin-left:251.65pt;margin-top:.3pt;width:248.55pt;height:.05pt;z-index:251663360;visibility:visible;mso-wrap-style:square;mso-width-percent:0;mso-wrap-distance-left:9pt;mso-wrap-distance-top:0;mso-wrap-distance-right:9pt;mso-wrap-distance-bottom:0;mso-position-horizontal:absolute;mso-position-horizontal-relative:text;mso-position-vertical:absolute;mso-position-vertical-relative:text;mso-width-percent:0;mso-width-relative:margin;v-text-anchor:top" stroked="f" type="#_x0000_t202" o:gfxdata="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" w14:anchorId="5CB2E506">
                 <v:textbox style="mso-fit-shape-to-text:t" inset="0,0,0,0">
                   <w:txbxContent>
                     <w:p>
@@ -1278,24 +1464,24 @@
       </w:pPr>
       <w:r>
         <w:rPr>
-          <w:b/>
-          <w:bCs/>
+          <w:b w:val="1"/>
+          <w:bCs w:val="1"/>
           <w:color w:val="FF0000"/>
         </w:rPr>
         <w:t xml:space="preserve">Figure </w:t>
       </w:r>
       <w:r>
         <w:rPr>
-          <w:b/>
-          <w:bCs/>
+          <w:b w:val="1"/>
+          <w:bCs w:val="1"/>
           <w:color w:val="FF0000"/>
         </w:rPr>
         <w:t>7</w:t>
       </w:r>
       <w:r>
         <w:rPr>
-          <w:b/>
-          <w:bCs/>
+          <w:b w:val="1"/>
+          <w:bCs w:val="1"/>
           <w:color w:val="FF0000"/>
         </w:rPr>
         <w:t>:</w:t>
@@ -1304,7 +1490,19 @@
         <w:rPr>
           <w:color w:val="FF0000"/>
         </w:rPr>
-        <w:t xml:space="preserve"> analytes tied to titration analysis.</w:t>
+        <w:t xml:space="preserve"> </w:t>
+      </w:r>
+      <w:r>
+        <w:rPr>
+          <w:color w:val="FF0000"/>
+        </w:rPr>
+        <w:t>Analytes</w:t>
+      </w:r>
+      <w:r>
+        <w:rPr>
+          <w:color w:val="FF0000"/>
+        </w:rPr>
+        <w:t xml:space="preserve"> tied to titration analysis.</w:t>
       </w:r>
     </w:p>
     <w:p>
@@ -1314,15 +1512,47 @@
         </w:tabs>
       </w:pPr>
       <w:r>
-        <w:t xml:space="preserve">Cr(III) </w:t>
-      </w:r>
-      <w:r>
-        <w:t>analyst is a special type of titration analysis that takes the difference of Cr2O3 and Cr(VI) titration analysis. Let’s walk through ho</w:t>
-      </w:r>
-      <w:r>
+        <w:rPr/>
+        <w:t>Cr(</w:t>
+      </w:r>
+      <w:r>
+        <w:rPr/>
+        <w:t xml:space="preserve">III) </w:t>
+      </w:r>
+      <w:r>
+        <w:rPr/>
+        <w:t xml:space="preserve">analyst is a special type of titration analysis that takes the difference </w:t>
+      </w:r>
+      <w:r>
+        <w:rPr/>
+        <w:t>between</w:t>
+      </w:r>
+      <w:r>
+        <w:rPr/>
+        <w:t xml:space="preserve"> Cr2O3 and </w:t>
+      </w:r>
+      <w:r>
+        <w:rPr/>
+        <w:t>Cr(</w:t>
+      </w:r>
+      <w:r>
+        <w:rPr/>
+        <w:t xml:space="preserve">VI) titration analysis. </w:t>
+      </w:r>
+      <w:r>
+        <w:rPr/>
+        <w:t>Let’s</w:t>
+      </w:r>
+      <w:r>
+        <w:rPr/>
+        <w:t xml:space="preserve"> walk through ho</w:t>
+      </w:r>
+      <w:r>
+        <w:rPr/>
         <w:t>w</w:t>
       </w:r>
       <w:r>
+        <w:rPr/>
         <w:t xml:space="preserve"> to set that up in the program.</w:t>
       </w:r>
     </w:p>
@@ -1430,7 +1660,7 @@
           </mc:Choice>
           <mc:Fallback>
             <w:pict>
-              <v:shape w14:anchorId="0FD11C01" id="_x0000_s1028" type="#_x0000_t202" style="position:absolute;margin-left:250.5pt;margin-top:274.05pt;width:217.25pt;height:.05pt;z-index:251666432;visibility:visible;mso-wrap-style:square;mso-wrap-distance-left:9pt;mso-wrap-distance-top:0;mso-wrap-distance-right:9pt;mso-wrap-distance-bottom:0;mso-position-horizontal:absolute;mso-position-horizontal-relative:text;mso-position-vertical:absolute;mso-position-vertical-relative:text;v-text-anchor:top" o:gfxdata="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" stroked="f">
+              <v:shape id="_x0000_s1028" style="position:absolute;margin-left:250.5pt;margin-top:274.05pt;width:217.25pt;height:.05pt;z-index:251666432;visibility:visible;mso-wrap-style:square;mso-wrap-distance-left:9pt;mso-wrap-distance-top:0;mso-wrap-distance-right:9pt;mso-wrap-distance-bottom:0;mso-position-horizontal:absolute;mso-position-horizontal-relative:text;mso-position-vertical:absolute;mso-position-vertical-relative:text;v-text-anchor:top" stroked="f" type="#_x0000_t202" o:gfxdata="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" w14:anchorId="0FD11C01">
                 <v:textbox style="mso-fit-shape-to-text:t" inset="0,0,0,0">
                   <w:txbxContent>
                     <w:p>
@@ -1845,7 +2075,7 @@
           </mc:Choice>
           <mc:Fallback>
             <w:pict>
-              <v:shape w14:anchorId="1FB30C27" id="_x0000_s1029" type="#_x0000_t202" style="position:absolute;margin-left:247pt;margin-top:168.1pt;width:241.65pt;height:.05pt;z-index:251668480;visibility:visible;mso-wrap-style:square;mso-wrap-distance-left:9pt;mso-wrap-distance-top:0;mso-wrap-distance-right:9pt;mso-wrap-distance-bottom:0;mso-position-horizontal:absolute;mso-position-horizontal-relative:text;mso-position-vertical:absolute;mso-position-vertical-relative:text;v-text-anchor:top" o:gfxdata="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" stroked="f">
+              <v:shape id="_x0000_s1029" style="position:absolute;margin-left:247pt;margin-top:168.1pt;width:241.65pt;height:.05pt;z-index:251668480;visibility:visible;mso-wrap-style:square;mso-wrap-distance-left:9pt;mso-wrap-distance-top:0;mso-wrap-distance-right:9pt;mso-wrap-distance-bottom:0;mso-position-horizontal:absolute;mso-position-horizontal-relative:text;mso-position-vertical:absolute;mso-position-vertical-relative:text;v-text-anchor:top" stroked="f" type="#_x0000_t202" o:gfxdata="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" w14:anchorId="1FB30C27">
                 <v:textbox style="mso-fit-shape-to-text:t" inset="0,0,0,0">
                   <w:txbxContent>
                     <w:p>
@@ -2080,8 +2310,24 @@
         </w:tabs>
       </w:pPr>
       <w:r>
-        <w:lastRenderedPageBreak/>
-        <w:t>We can also control the chemical compound of an analyte for example instead of reporting Na oxide we can report Na sulfite by creating a sulfite list in the configuration file and adding Na.</w:t>
+        <w:rPr/>
+        <w:t xml:space="preserve">We can also control the chemical compound of an </w:t>
+      </w:r>
+      <w:r>
+        <w:rPr/>
+        <w:t>analyte,</w:t>
+      </w:r>
+      <w:r>
+        <w:rPr/>
+        <w:t xml:space="preserve"> for example instead of reporting Na </w:t>
+      </w:r>
+      <w:r>
+        <w:rPr/>
+        <w:t>oxide</w:t>
+      </w:r>
+      <w:r>
+        <w:rPr/>
+        <w:t xml:space="preserve"> we can report Na sulfite by creating a sulfite list in the configuration file and adding Na.</w:t>
       </w:r>
     </w:p>
     <w:p>
@@ -2271,83 +2517,140 @@
         </w:tabs>
       </w:pPr>
       <w:r>
-        <w:lastRenderedPageBreak/>
+        <w:rPr/>
         <w:t xml:space="preserve">Location </w:t>
       </w:r>
       <w:r>
+        <w:rPr/>
         <w:t>of</w:t>
       </w:r>
       <w:r>
+        <w:rPr/>
         <w:t xml:space="preserve"> </w:t>
       </w:r>
       <w:r>
+        <w:rPr/>
         <w:t xml:space="preserve">the </w:t>
       </w:r>
       <w:r>
+        <w:rPr/>
         <w:t>sav</w:t>
       </w:r>
       <w:r>
+        <w:rPr/>
         <w:t>ed</w:t>
       </w:r>
       <w:r>
+        <w:rPr/>
         <w:t xml:space="preserve"> </w:t>
       </w:r>
       <w:r>
         <w:rPr>
-          <w:i/>
-          <w:iCs/>
+          <w:i w:val="1"/>
+          <w:iCs w:val="1"/>
         </w:rPr>
         <w:t>master_woorkbook.xlsx</w:t>
       </w:r>
       <w:r>
         <w:rPr>
-          <w:i/>
-          <w:iCs/>
+          <w:i w:val="1"/>
+          <w:iCs w:val="1"/>
         </w:rPr>
         <w:t xml:space="preserve"> </w:t>
       </w:r>
       <w:r>
+        <w:rPr/>
         <w:t xml:space="preserve">is </w:t>
       </w:r>
       <w:r>
+        <w:rPr/>
         <w:t xml:space="preserve">controlled by </w:t>
       </w:r>
       <w:r>
+        <w:rPr/>
         <w:t xml:space="preserve">attaching a URL to </w:t>
       </w:r>
       <w:r>
-        <w:t>folder</w:t>
-      </w:r>
-      <w:r>
+        <w:rPr/>
+        <w:t>directory</w:t>
+      </w:r>
+      <w:r>
+        <w:rPr/>
         <w:t xml:space="preserve"> in the Path section of the configuration file.</w:t>
       </w:r>
       <w:r>
+        <w:rPr/>
         <w:t xml:space="preserve"> If </w:t>
       </w:r>
       <w:r>
+        <w:rPr/>
         <w:t xml:space="preserve">a </w:t>
       </w:r>
       <w:r>
+        <w:rPr/>
         <w:t xml:space="preserve">path is </w:t>
       </w:r>
       <w:r>
+        <w:rPr/>
         <w:t xml:space="preserve">not </w:t>
       </w:r>
       <w:r>
-        <w:t>provided it defaults to directory that the program is running.</w:t>
-      </w:r>
-      <w:r>
+        <w:rPr/>
+        <w:t>provided,</w:t>
+      </w:r>
+      <w:r>
+        <w:rPr/>
+        <w:t xml:space="preserve"> it defaults to directory that the program is running.</w:t>
+      </w:r>
+      <w:r>
+        <w:rPr/>
         <w:t xml:space="preserve"> Use &lt;F1&gt; as shortcut to open the </w:t>
       </w:r>
       <w:r>
         <w:rPr>
-          <w:i/>
-          <w:iCs/>
+          <w:i w:val="1"/>
+          <w:iCs w:val="1"/>
         </w:rPr>
         <w:t>config.ini</w:t>
       </w:r>
       <w:r>
+        <w:rPr/>
         <w:t xml:space="preserve"> configuration file.</w:t>
+      </w:r>
+      <w:r>
+        <w:rPr/>
+        <w:t xml:space="preserve"> The </w:t>
+      </w:r>
+      <w:r>
+        <w:rPr>
+          <w:i w:val="1"/>
+          <w:iCs w:val="1"/>
+        </w:rPr>
+        <w:t>lot.csv</w:t>
+      </w:r>
+      <w:r>
+        <w:rPr/>
+        <w:t xml:space="preserve"> file is </w:t>
+      </w:r>
+      <w:r>
+        <w:rPr/>
+        <w:t>maintained</w:t>
+      </w:r>
+      <w:r>
+        <w:rPr/>
+        <w:t xml:space="preserve"> as a csv file that can be open with a text editor or excel.</w:t>
+      </w:r>
+      <w:r>
+        <w:rPr/>
+        <w:t xml:space="preserve"> Expiration dates should be formatted as such: Month date </w:t>
+      </w:r>
+      <w:r>
+        <w:rPr/>
+        <w:t>yyyy</w:t>
+      </w:r>
+      <w:r>
+        <w:rPr/>
+        <w:t>, month can be full form or abbreviated.</w:t>
       </w:r>
     </w:p>
     <w:p>
@@ -2359,7 +2662,7 @@
     </w:p>
     <w:sectPr>
       <w:headerReference w:type="default" r:id="rId19"/>
-      <w:pgSz w:w="12240" w:h="15840"/>
+      <w:pgSz w:w="12240" w:h="15840" w:orient="portrait"/>
       <w:pgMar w:top="1440" w:right="1440" w:bottom="1440" w:left="1440" w:header="720" w:footer="720" w:gutter="0"/>
       <w:cols w:space="720"/>
       <w:docGrid w:linePitch="360"/>
@@ -2428,13 +2731,13 @@
       <w:t>Carl Archemetre</w:t>
     </w:r>
     <w:r>
-      <w:ptab w:relativeTo="margin" w:alignment="center" w:leader="none"/>
+      <w:ptab w:alignment="center" w:relativeTo="margin" w:leader="none"/>
     </w:r>
     <w:r>
       <w:t>Material Characterization</w:t>
     </w:r>
     <w:r>
-      <w:ptab w:relativeTo="margin" w:alignment="right" w:leader="none"/>
+      <w:ptab w:alignment="right" w:relativeTo="margin" w:leader="none"/>
     </w:r>
     <w:r>
       <w:t>May 27, 2026</w:t>
@@ -2448,7 +2751,7 @@
   <w:docDefaults>
     <w:rPrDefault>
       <w:rPr>
-        <w:rFonts w:asciiTheme="minorHAnsi" w:eastAsiaTheme="minorHAnsi" w:hAnsiTheme="minorHAnsi" w:cstheme="minorBidi"/>
+        <w:rFonts w:asciiTheme="minorHAnsi" w:hAnsiTheme="minorHAnsi" w:eastAsiaTheme="minorHAnsi" w:cstheme="minorBidi"/>
         <w:kern w:val="2"/>
         <w:sz w:val="24"/>
         <w:szCs w:val="24"/>
@@ -2465,14 +2768,14 @@
   <w:latentStyles w:defLockedState="0" w:defUIPriority="99" w:defSemiHidden="0" w:defUnhideWhenUsed="0" w:defQFormat="0" w:count="376">
     <w:lsdException w:name="Normal" w:uiPriority="0" w:qFormat="1"/>
     <w:lsdException w:name="heading 1" w:uiPriority="9" w:qFormat="1"/>
-    <w:lsdException w:name="heading 2" w:semiHidden="1" w:uiPriority="9" w:unhideWhenUsed="1" w:qFormat="1"/>
-    <w:lsdException w:name="heading 3" w:semiHidden="1" w:uiPriority="9" w:unhideWhenUsed="1" w:qFormat="1"/>
-    <w:lsdException w:name="heading 4" w:semiHidden="1" w:uiPriority="9" w:unhideWhenUsed="1" w:qFormat="1"/>
-    <w:lsdException w:name="heading 5" w:semiHidden="1" w:uiPriority="9" w:unhideWhenUsed="1" w:qFormat="1"/>
-    <w:lsdException w:name="heading 6" w:semiHidden="1" w:uiPriority="9" w:unhideWhenUsed="1" w:qFormat="1"/>
-    <w:lsdException w:name="heading 7" w:semiHidden="1" w:uiPriority="9" w:unhideWhenUsed="1" w:qFormat="1"/>
-    <w:lsdException w:name="heading 8" w:semiHidden="1" w:uiPriority="9" w:unhideWhenUsed="1" w:qFormat="1"/>
-    <w:lsdException w:name="heading 9" w:semiHidden="1" w:uiPriority="9" w:unhideWhenUsed="1" w:qFormat="1"/>
+    <w:lsdException w:name="heading 2" w:uiPriority="9" w:semiHidden="1" w:unhideWhenUsed="1" w:qFormat="1"/>
+    <w:lsdException w:name="heading 3" w:uiPriority="9" w:semiHidden="1" w:unhideWhenUsed="1" w:qFormat="1"/>
+    <w:lsdException w:name="heading 4" w:uiPriority="9" w:semiHidden="1" w:unhideWhenUsed="1" w:qFormat="1"/>
+    <w:lsdException w:name="heading 5" w:uiPriority="9" w:semiHidden="1" w:unhideWhenUsed="1" w:qFormat="1"/>
+    <w:lsdException w:name="heading 6" w:uiPriority="9" w:semiHidden="1" w:unhideWhenUsed="1" w:qFormat="1"/>
+    <w:lsdException w:name="heading 7" w:uiPriority="9" w:semiHidden="1" w:unhideWhenUsed="1" w:qFormat="1"/>
+    <w:lsdException w:name="heading 8" w:uiPriority="9" w:semiHidden="1" w:unhideWhenUsed="1" w:qFormat="1"/>
+    <w:lsdException w:name="heading 9" w:uiPriority="9" w:semiHidden="1" w:unhideWhenUsed="1" w:qFormat="1"/>
     <w:lsdException w:name="index 1" w:semiHidden="1" w:unhideWhenUsed="1"/>
     <w:lsdException w:name="index 2" w:semiHidden="1" w:unhideWhenUsed="1"/>
     <w:lsdException w:name="index 3" w:semiHidden="1" w:unhideWhenUsed="1"/>
@@ -2482,22 +2785,22 @@
     <w:lsdException w:name="index 7" w:semiHidden="1" w:unhideWhenUsed="1"/>
     <w:lsdException w:name="index 8" w:semiHidden="1" w:unhideWhenUsed="1"/>
     <w:lsdException w:name="index 9" w:semiHidden="1" w:unhideWhenUsed="1"/>
-    <w:lsdException w:name="toc 1" w:semiHidden="1" w:uiPriority="39" w:unhideWhenUsed="1"/>
-    <w:lsdException w:name="toc 2" w:semiHidden="1" w:uiPriority="39" w:unhideWhenUsed="1"/>
-    <w:lsdException w:name="toc 3" w:semiHidden="1" w:uiPriority="39" w:unhideWhenUsed="1"/>
-    <w:lsdException w:name="toc 4" w:semiHidden="1" w:uiPriority="39" w:unhideWhenUsed="1"/>
-    <w:lsdException w:name="toc 5" w:semiHidden="1" w:uiPriority="39" w:unhideWhenUsed="1"/>
-    <w:lsdException w:name="toc 6" w:semiHidden="1" w:uiPriority="39" w:unhideWhenUsed="1"/>
-    <w:lsdException w:name="toc 7" w:semiHidden="1" w:uiPriority="39" w:unhideWhenUsed="1"/>
-    <w:lsdException w:name="toc 8" w:semiHidden="1" w:uiPriority="39" w:unhideWhenUsed="1"/>
-    <w:lsdException w:name="toc 9" w:semiHidden="1" w:uiPriority="39" w:unhideWhenUsed="1"/>
+    <w:lsdException w:name="toc 1" w:uiPriority="39" w:semiHidden="1" w:unhideWhenUsed="1"/>
+    <w:lsdException w:name="toc 2" w:uiPriority="39" w:semiHidden="1" w:unhideWhenUsed="1"/>
+    <w:lsdException w:name="toc 3" w:uiPriority="39" w:semiHidden="1" w:unhideWhenUsed="1"/>
+    <w:lsdException w:name="toc 4" w:uiPriority="39" w:semiHidden="1" w:unhideWhenUsed="1"/>
+    <w:lsdException w:name="toc 5" w:uiPriority="39" w:semiHidden="1" w:unhideWhenUsed="1"/>
+    <w:lsdException w:name="toc 6" w:uiPriority="39" w:semiHidden="1" w:unhideWhenUsed="1"/>
+    <w:lsdException w:name="toc 7" w:uiPriority="39" w:semiHidden="1" w:unhideWhenUsed="1"/>
+    <w:lsdException w:name="toc 8" w:uiPriority="39" w:semiHidden="1" w:unhideWhenUsed="1"/>
+    <w:lsdException w:name="toc 9" w:uiPriority="39" w:semiHidden="1" w:unhideWhenUsed="1"/>
     <w:lsdException w:name="Normal Indent" w:semiHidden="1" w:unhideWhenUsed="1"/>
     <w:lsdException w:name="footnote text" w:semiHidden="1" w:unhideWhenUsed="1"/>
     <w:lsdException w:name="annotation text" w:semiHidden="1" w:unhideWhenUsed="1"/>
     <w:lsdException w:name="header" w:semiHidden="1" w:unhideWhenUsed="1"/>
     <w:lsdException w:name="footer" w:semiHidden="1" w:unhideWhenUsed="1"/>
     <w:lsdException w:name="index heading" w:semiHidden="1" w:unhideWhenUsed="1"/>
-    <w:lsdException w:name="caption" w:semiHidden="1" w:uiPriority="35" w:unhideWhenUsed="1" w:qFormat="1"/>
+    <w:lsdException w:name="caption" w:uiPriority="35" w:semiHidden="1" w:unhideWhenUsed="1" w:qFormat="1"/>
     <w:lsdException w:name="table of figures" w:semiHidden="1" w:unhideWhenUsed="1"/>
     <w:lsdException w:name="envelope address" w:semiHidden="1" w:unhideWhenUsed="1"/>
     <w:lsdException w:name="envelope return" w:semiHidden="1" w:unhideWhenUsed="1"/>
@@ -2528,7 +2831,7 @@
     <w:lsdException w:name="Title" w:uiPriority="10" w:qFormat="1"/>
     <w:lsdException w:name="Closing" w:semiHidden="1" w:unhideWhenUsed="1"/>
     <w:lsdException w:name="Signature" w:semiHidden="1" w:unhideWhenUsed="1"/>
-    <w:lsdException w:name="Default Paragraph Font" w:semiHidden="1" w:uiPriority="1" w:unhideWhenUsed="1"/>
+    <w:lsdException w:name="Default Paragraph Font" w:uiPriority="1" w:semiHidden="1" w:unhideWhenUsed="1"/>
     <w:lsdException w:name="Body Text" w:semiHidden="1" w:unhideWhenUsed="1"/>
     <w:lsdException w:name="Body Text Indent" w:semiHidden="1" w:unhideWhenUsed="1"/>
     <w:lsdException w:name="List Continue" w:semiHidden="1" w:unhideWhenUsed="1"/>
@@ -2728,8 +3031,8 @@
     <w:lsdException w:name="Subtle Reference" w:uiPriority="31" w:qFormat="1"/>
     <w:lsdException w:name="Intense Reference" w:uiPriority="32" w:qFormat="1"/>
     <w:lsdException w:name="Book Title" w:uiPriority="33" w:qFormat="1"/>
-    <w:lsdException w:name="Bibliography" w:semiHidden="1" w:uiPriority="37" w:unhideWhenUsed="1"/>
-    <w:lsdException w:name="TOC Heading" w:semiHidden="1" w:uiPriority="39" w:unhideWhenUsed="1" w:qFormat="1"/>
+    <w:lsdException w:name="Bibliography" w:uiPriority="37" w:semiHidden="1" w:unhideWhenUsed="1"/>
+    <w:lsdException w:name="TOC Heading" w:uiPriority="39" w:semiHidden="1" w:unhideWhenUsed="1" w:qFormat="1"/>
     <w:lsdException w:name="Plain Table 1" w:uiPriority="41"/>
     <w:lsdException w:name="Plain Table 2" w:uiPriority="42"/>
     <w:lsdException w:name="Plain Table 3" w:uiPriority="43"/>
@@ -2840,7 +3143,7 @@
     <w:lsdException w:name="Unresolved Mention" w:semiHidden="1" w:unhideWhenUsed="1"/>
     <w:lsdException w:name="Smart Link" w:semiHidden="1" w:unhideWhenUsed="1"/>
   </w:latentStyles>
-  <w:style w:type="paragraph" w:default="1" w:styleId="Normal">
+  <w:style w:type="paragraph" w:styleId="Normal" w:default="1">
     <w:name w:val="Normal"/>
     <w:qFormat/>
   </w:style>
@@ -2859,7 +3162,7 @@
       <w:outlineLvl w:val="0"/>
     </w:pPr>
     <w:rPr>
-      <w:rFonts w:asciiTheme="majorHAnsi" w:eastAsiaTheme="majorEastAsia" w:hAnsiTheme="majorHAnsi" w:cstheme="majorBidi"/>
+      <w:rFonts w:asciiTheme="majorHAnsi" w:hAnsiTheme="majorHAnsi" w:eastAsiaTheme="majorEastAsia" w:cstheme="majorBidi"/>
       <w:color w:val="0F4761" w:themeColor="accent1" w:themeShade="BF"/>
       <w:sz w:val="40"/>
       <w:szCs w:val="40"/>
@@ -2882,7 +3185,7 @@
       <w:outlineLvl w:val="1"/>
     </w:pPr>
     <w:rPr>
-      <w:rFonts w:asciiTheme="majorHAnsi" w:eastAsiaTheme="majorEastAsia" w:hAnsiTheme="majorHAnsi" w:cstheme="majorBidi"/>
+      <w:rFonts w:asciiTheme="majorHAnsi" w:hAnsiTheme="majorHAnsi" w:eastAsiaTheme="majorEastAsia" w:cstheme="majorBidi"/>
       <w:color w:val="0F4761" w:themeColor="accent1" w:themeShade="BF"/>
       <w:sz w:val="32"/>
       <w:szCs w:val="32"/>
@@ -3043,13 +3346,13 @@
       <w:color w:val="272727" w:themeColor="text1" w:themeTint="D8"/>
     </w:rPr>
   </w:style>
-  <w:style w:type="character" w:default="1" w:styleId="DefaultParagraphFont">
+  <w:style w:type="character" w:styleId="DefaultParagraphFont" w:default="1">
     <w:name w:val="Default Paragraph Font"/>
     <w:uiPriority w:val="1"/>
     <w:semiHidden/>
     <w:unhideWhenUsed/>
   </w:style>
-  <w:style w:type="table" w:default="1" w:styleId="TableNormal">
+  <w:style w:type="table" w:styleId="TableNormal" w:default="1">
     <w:name w:val="Normal Table"/>
     <w:uiPriority w:val="99"/>
     <w:semiHidden/>
@@ -3064,26 +3367,26 @@
       </w:tblCellMar>
     </w:tblPr>
   </w:style>
-  <w:style w:type="numbering" w:default="1" w:styleId="NoList">
+  <w:style w:type="numbering" w:styleId="NoList" w:default="1">
     <w:name w:val="No List"/>
     <w:uiPriority w:val="99"/>
     <w:semiHidden/>
     <w:unhideWhenUsed/>
   </w:style>
-  <w:style w:type="character" w:customStyle="1" w:styleId="Heading1Char">
+  <w:style w:type="character" w:styleId="Heading1Char" w:customStyle="1">
     <w:name w:val="Heading 1 Char"/>
     <w:basedOn w:val="DefaultParagraphFont"/>
     <w:link w:val="Heading1"/>
     <w:uiPriority w:val="9"/>
     <w:rsid w:val="007C3E05"/>
     <w:rPr>
-      <w:rFonts w:asciiTheme="majorHAnsi" w:eastAsiaTheme="majorEastAsia" w:hAnsiTheme="majorHAnsi" w:cstheme="majorBidi"/>
+      <w:rFonts w:asciiTheme="majorHAnsi" w:hAnsiTheme="majorHAnsi" w:eastAsiaTheme="majorEastAsia" w:cstheme="majorBidi"/>
       <w:color w:val="0F4761" w:themeColor="accent1" w:themeShade="BF"/>
       <w:sz w:val="40"/>
       <w:szCs w:val="40"/>
     </w:rPr>
   </w:style>
-  <w:style w:type="character" w:customStyle="1" w:styleId="Heading2Char">
+  <w:style w:type="character" w:styleId="Heading2Char" w:customStyle="1">
     <w:name w:val="Heading 2 Char"/>
     <w:basedOn w:val="DefaultParagraphFont"/>
     <w:link w:val="Heading2"/>
@@ -3091,13 +3394,13 @@
     <w:semiHidden/>
     <w:rsid w:val="007C3E05"/>
     <w:rPr>
-      <w:rFonts w:asciiTheme="majorHAnsi" w:eastAsiaTheme="majorEastAsia" w:hAnsiTheme="majorHAnsi" w:cstheme="majorBidi"/>
+      <w:rFonts w:asciiTheme="majorHAnsi" w:hAnsiTheme="majorHAnsi" w:eastAsiaTheme="majorEastAsia" w:cstheme="majorBidi"/>
       <w:color w:val="0F4761" w:themeColor="accent1" w:themeShade="BF"/>
       <w:sz w:val="32"/>
       <w:szCs w:val="32"/>
     </w:rPr>
   </w:style>
-  <w:style w:type="character" w:customStyle="1" w:styleId="Heading3Char">
+  <w:style w:type="character" w:styleId="Heading3Char" w:customStyle="1">
     <w:name w:val="Heading 3 Char"/>
     <w:basedOn w:val="DefaultParagraphFont"/>
     <w:link w:val="Heading3"/>
@@ -3111,7 +3414,7 @@
       <w:szCs w:val="28"/>
     </w:rPr>
   </w:style>
-  <w:style w:type="character" w:customStyle="1" w:styleId="Heading4Char">
+  <w:style w:type="character" w:styleId="Heading4Char" w:customStyle="1">
     <w:name w:val="Heading 4 Char"/>
     <w:basedOn w:val="DefaultParagraphFont"/>
     <w:link w:val="Heading4"/>
@@ -3125,7 +3428,7 @@
       <w:color w:val="0F4761" w:themeColor="accent1" w:themeShade="BF"/>
     </w:rPr>
   </w:style>
-  <w:style w:type="character" w:customStyle="1" w:styleId="Heading5Char">
+  <w:style w:type="character" w:styleId="Heading5Char" w:customStyle="1">
     <w:name w:val="Heading 5 Char"/>
     <w:basedOn w:val="DefaultParagraphFont"/>
     <w:link w:val="Heading5"/>
@@ -3137,7 +3440,7 @@
       <w:color w:val="0F4761" w:themeColor="accent1" w:themeShade="BF"/>
     </w:rPr>
   </w:style>
-  <w:style w:type="character" w:customStyle="1" w:styleId="Heading6Char">
+  <w:style w:type="character" w:styleId="Heading6Char" w:customStyle="1">
     <w:name w:val="Heading 6 Char"/>
     <w:basedOn w:val="DefaultParagraphFont"/>
     <w:link w:val="Heading6"/>
@@ -3151,7 +3454,7 @@
       <w:color w:val="595959" w:themeColor="text1" w:themeTint="A6"/>
     </w:rPr>
   </w:style>
-  <w:style w:type="character" w:customStyle="1" w:styleId="Heading7Char">
+  <w:style w:type="character" w:styleId="Heading7Char" w:customStyle="1">
     <w:name w:val="Heading 7 Char"/>
     <w:basedOn w:val="DefaultParagraphFont"/>
     <w:link w:val="Heading7"/>
@@ -3163,7 +3466,7 @@
       <w:color w:val="595959" w:themeColor="text1" w:themeTint="A6"/>
     </w:rPr>
   </w:style>
-  <w:style w:type="character" w:customStyle="1" w:styleId="Heading8Char">
+  <w:style w:type="character" w:styleId="Heading8Char" w:customStyle="1">
     <w:name w:val="Heading 8 Char"/>
     <w:basedOn w:val="DefaultParagraphFont"/>
     <w:link w:val="Heading8"/>
@@ -3177,7 +3480,7 @@
       <w:color w:val="272727" w:themeColor="text1" w:themeTint="D8"/>
     </w:rPr>
   </w:style>
-  <w:style w:type="character" w:customStyle="1" w:styleId="Heading9Char">
+  <w:style w:type="character" w:styleId="Heading9Char" w:customStyle="1">
     <w:name w:val="Heading 9 Char"/>
     <w:basedOn w:val="DefaultParagraphFont"/>
     <w:link w:val="Heading9"/>
@@ -3202,21 +3505,21 @@
       <w:contextualSpacing/>
     </w:pPr>
     <w:rPr>
-      <w:rFonts w:asciiTheme="majorHAnsi" w:eastAsiaTheme="majorEastAsia" w:hAnsiTheme="majorHAnsi" w:cstheme="majorBidi"/>
+      <w:rFonts w:asciiTheme="majorHAnsi" w:hAnsiTheme="majorHAnsi" w:eastAsiaTheme="majorEastAsia" w:cstheme="majorBidi"/>
       <w:spacing w:val="-10"/>
       <w:kern w:val="28"/>
       <w:sz w:val="56"/>
       <w:szCs w:val="56"/>
     </w:rPr>
   </w:style>
-  <w:style w:type="character" w:customStyle="1" w:styleId="TitleChar">
+  <w:style w:type="character" w:styleId="TitleChar" w:customStyle="1">
     <w:name w:val="Title Char"/>
     <w:basedOn w:val="DefaultParagraphFont"/>
     <w:link w:val="Title"/>
     <w:uiPriority w:val="10"/>
     <w:rsid w:val="007C3E05"/>
     <w:rPr>
-      <w:rFonts w:asciiTheme="majorHAnsi" w:eastAsiaTheme="majorEastAsia" w:hAnsiTheme="majorHAnsi" w:cstheme="majorBidi"/>
+      <w:rFonts w:asciiTheme="majorHAnsi" w:hAnsiTheme="majorHAnsi" w:eastAsiaTheme="majorEastAsia" w:cstheme="majorBidi"/>
       <w:spacing w:val="-10"/>
       <w:kern w:val="28"/>
       <w:sz w:val="56"/>
@@ -3244,7 +3547,7 @@
       <w:szCs w:val="28"/>
     </w:rPr>
   </w:style>
-  <w:style w:type="character" w:customStyle="1" w:styleId="SubtitleChar">
+  <w:style w:type="character" w:styleId="SubtitleChar" w:customStyle="1">
     <w:name w:val="Subtitle Char"/>
     <w:basedOn w:val="DefaultParagraphFont"/>
     <w:link w:val="Subtitle"/>
@@ -3276,7 +3579,7 @@
       <w:color w:val="404040" w:themeColor="text1" w:themeTint="BF"/>
     </w:rPr>
   </w:style>
-  <w:style w:type="character" w:customStyle="1" w:styleId="QuoteChar">
+  <w:style w:type="character" w:styleId="QuoteChar" w:customStyle="1">
     <w:name w:val="Quote Char"/>
     <w:basedOn w:val="DefaultParagraphFont"/>
     <w:link w:val="Quote"/>
@@ -3321,8 +3624,8 @@
     <w:rsid w:val="007C3E05"/>
     <w:pPr>
       <w:pBdr>
-        <w:top w:val="single" w:sz="4" w:space="10" w:color="0F4761" w:themeColor="accent1" w:themeShade="BF"/>
-        <w:bottom w:val="single" w:sz="4" w:space="10" w:color="0F4761" w:themeColor="accent1" w:themeShade="BF"/>
+        <w:top w:val="single" w:color="0F4761" w:themeColor="accent1" w:themeShade="BF" w:sz="4" w:space="10"/>
+        <w:bottom w:val="single" w:color="0F4761" w:themeColor="accent1" w:themeShade="BF" w:sz="4" w:space="10"/>
       </w:pBdr>
       <w:spacing w:before="360" w:after="360"/>
       <w:ind w:left="864" w:right="864"/>
@@ -3334,7 +3637,7 @@
       <w:color w:val="0F4761" w:themeColor="accent1" w:themeShade="BF"/>
     </w:rPr>
   </w:style>
-  <w:style w:type="character" w:customStyle="1" w:styleId="IntenseQuoteChar">
+  <w:style w:type="character" w:styleId="IntenseQuoteChar" w:customStyle="1">
     <w:name w:val="Intense Quote Char"/>
     <w:basedOn w:val="DefaultParagraphFont"/>
     <w:link w:val="IntenseQuote"/>
@@ -3375,7 +3678,7 @@
       <w:spacing w:after="0" w:line="240" w:lineRule="auto"/>
     </w:pPr>
   </w:style>
-  <w:style w:type="character" w:customStyle="1" w:styleId="HeaderChar">
+  <w:style w:type="character" w:styleId="HeaderChar" w:customStyle="1">
     <w:name w:val="Header Char"/>
     <w:basedOn w:val="DefaultParagraphFont"/>
     <w:link w:val="Header"/>
@@ -3397,7 +3700,7 @@
       <w:spacing w:after="0" w:line="240" w:lineRule="auto"/>
     </w:pPr>
   </w:style>
-  <w:style w:type="character" w:customStyle="1" w:styleId="FooterChar">
+  <w:style w:type="character" w:styleId="FooterChar" w:customStyle="1">
     <w:name w:val="Footer Char"/>
     <w:basedOn w:val="DefaultParagraphFont"/>
     <w:link w:val="Footer"/>
@@ -3427,7 +3730,7 @@
 </file>
 
 <file path=word/theme/theme1.xml><?xml version="1.0" encoding="utf-8"?>
-<a:theme xmlns:a="http://schemas.openxmlformats.org/drawingml/2006/main" name="Office Theme">
+<a:theme xmlns:a="http://schemas.openxmlformats.org/drawingml/2006/main" xmlns:thm15="http://schemas.microsoft.com/office/thememl/2012/main" name="Office Theme">
   <a:themeElements>
     <a:clrScheme name="Office">
       <a:dk1>
@@ -3739,4 +4042,297 @@
     </a:ext>
   </a:extLst>
 </a:theme>
+</file>
+
+<file path=customXml/item1.xml><?xml version="1.0" encoding="utf-8"?>
+<ct:contentTypeSchema xmlns:ct="http://schemas.microsoft.com/office/2006/metadata/contentType" xmlns:ma="http://schemas.microsoft.com/office/2006/metadata/properties/metaAttributes" ct:_="" ma:_="" ma:contentTypeName="Document" ma:contentTypeID="0x0101004CBC8261071EE84099EB6C95137F5AB8" ma:contentTypeVersion="19" ma:contentTypeDescription="Create a new document." ma:contentTypeScope="" ma:versionID="4637ae707e710fe4318e646ac5c93b46">
+  <xsd:schema xmlns:xsd="http://www.w3.org/2001/XMLSchema" xmlns:xs="http://www.w3.org/2001/XMLSchema" xmlns:p="http://schemas.microsoft.com/office/2006/metadata/properties" xmlns:ns2="0fc475c1-99c8-4a27-b640-1b405f183953" xmlns:ns3="23ce4f88-cd98-46c7-a231-3c68dd29b0d7" targetNamespace="http://schemas.microsoft.com/office/2006/metadata/properties" ma:root="true" ma:fieldsID="1056b3aed422a163a2baf6ce204e82e4" ns2:_="" ns3:_="">
+    <xsd:import namespace="0fc475c1-99c8-4a27-b640-1b405f183953"/>
+    <xsd:import namespace="23ce4f88-cd98-46c7-a231-3c68dd29b0d7"/>
+    <xsd:element name="properties">
+      <xsd:complexType>
+        <xsd:sequence>
+          <xsd:element name="documentManagement">
+            <xsd:complexType>
+              <xsd:all>
+                <xsd:element ref="ns2:SharedWithUsers" minOccurs="0"/>
+                <xsd:element ref="ns2:SharedWithDetails" minOccurs="0"/>
+                <xsd:element ref="ns3:MediaServiceMetadata" minOccurs="0"/>
+                <xsd:element ref="ns3:MediaServiceFastMetadata" minOccurs="0"/>
+                <xsd:element ref="ns3:MediaServiceAutoKeyPoints" minOccurs="0"/>
+                <xsd:element ref="ns3:MediaServiceKeyPoints" minOccurs="0"/>
+                <xsd:element ref="ns3:MediaServiceDateTaken" minOccurs="0"/>
+                <xsd:element ref="ns3:MediaServiceAutoTags" minOccurs="0"/>
+                <xsd:element ref="ns3:MediaServiceGenerationTime" minOccurs="0"/>
+                <xsd:element ref="ns3:MediaServiceEventHashCode" minOccurs="0"/>
+                <xsd:element ref="ns3:MediaServiceOCR" minOccurs="0"/>
+                <xsd:element ref="ns3:MediaServiceObjectDetectorVersions" minOccurs="0"/>
+                <xsd:element ref="ns3:MediaLengthInSeconds" minOccurs="0"/>
+                <xsd:element ref="ns3:MediaServiceSearchProperties" minOccurs="0"/>
+                <xsd:element ref="ns3:lcf76f155ced4ddcb4097134ff3c332f" minOccurs="0"/>
+                <xsd:element ref="ns2:TaxCatchAll" minOccurs="0"/>
+                <xsd:element ref="ns3:MediaServiceLocation" minOccurs="0"/>
+                <xsd:element ref="ns3:MediaServiceBillingMetadata" minOccurs="0"/>
+              </xsd:all>
+            </xsd:complexType>
+          </xsd:element>
+        </xsd:sequence>
+      </xsd:complexType>
+    </xsd:element>
+  </xsd:schema>
+  <xsd:schema xmlns:xsd="http://www.w3.org/2001/XMLSchema" xmlns:xs="http://www.w3.org/2001/XMLSchema" xmlns:dms="http://schemas.microsoft.com/office/2006/documentManagement/types" xmlns:pc="http://schemas.microsoft.com/office/infopath/2007/PartnerControls" targetNamespace="0fc475c1-99c8-4a27-b640-1b405f183953" elementFormDefault="qualified">
+    <xsd:import namespace="http://schemas.microsoft.com/office/2006/documentManagement/types"/>
+    <xsd:import namespace="http://schemas.microsoft.com/office/infopath/2007/PartnerControls"/>
+    <xsd:element name="SharedWithUsers" ma:index="8" nillable="true" ma:displayName="Shared With" ma:internalName="SharedWithUsers" ma:readOnly="true">
+      <xsd:complexType>
+        <xsd:complexContent>
+          <xsd:extension base="dms:UserMulti">
+            <xsd:sequence>
+              <xsd:element name="UserInfo" minOccurs="0" maxOccurs="unbounded">
+                <xsd:complexType>
+                  <xsd:sequence>
+                    <xsd:element name="DisplayName" type="xsd:string" minOccurs="0"/>
+                    <xsd:element name="AccountId" type="dms:UserId" minOccurs="0" nillable="true"/>
+                    <xsd:element name="AccountType" type="xsd:string" minOccurs="0"/>
+                  </xsd:sequence>
+                </xsd:complexType>
+              </xsd:element>
+            </xsd:sequence>
+          </xsd:extension>
+        </xsd:complexContent>
+      </xsd:complexType>
+    </xsd:element>
+    <xsd:element name="SharedWithDetails" ma:index="9" nillable="true" ma:displayName="Shared With Details" ma:internalName="SharedWithDetails" ma:readOnly="true">
+      <xsd:simpleType>
+        <xsd:restriction base="dms:Note">
+          <xsd:maxLength value="255"/>
+        </xsd:restriction>
+      </xsd:simpleType>
+    </xsd:element>
+    <xsd:element name="TaxCatchAll" ma:index="24" nillable="true" ma:displayName="Taxonomy Catch All Column" ma:hidden="true" ma:list="{84542349-f9da-48a9-add3-fb476fc1f6f5}" ma:internalName="TaxCatchAll" ma:showField="CatchAllData" ma:web="0fc475c1-99c8-4a27-b640-1b405f183953">
+      <xsd:complexType>
+        <xsd:complexContent>
+          <xsd:extension base="dms:MultiChoiceLookup">
+            <xsd:sequence>
+              <xsd:element name="Value" type="dms:Lookup" maxOccurs="unbounded" minOccurs="0" nillable="true"/>
+            </xsd:sequence>
+          </xsd:extension>
+        </xsd:complexContent>
+      </xsd:complexType>
+    </xsd:element>
+  </xsd:schema>
+  <xsd:schema xmlns:xsd="http://www.w3.org/2001/XMLSchema" xmlns:xs="http://www.w3.org/2001/XMLSchema" xmlns:dms="http://schemas.microsoft.com/office/2006/documentManagement/types" xmlns:pc="http://schemas.microsoft.com/office/infopath/2007/PartnerControls" targetNamespace="23ce4f88-cd98-46c7-a231-3c68dd29b0d7" elementFormDefault="qualified">
+    <xsd:import namespace="http://schemas.microsoft.com/office/2006/documentManagement/types"/>
+    <xsd:import namespace="http://schemas.microsoft.com/office/infopath/2007/PartnerControls"/>
+    <xsd:element name="MediaServiceMetadata" ma:index="10" nillable="true" ma:displayName="MediaServiceMetadata" ma:hidden="true" ma:internalName="MediaServiceMetadata" ma:readOnly="true">
+      <xsd:simpleType>
+        <xsd:restriction base="dms:Note"/>
+      </xsd:simpleType>
+    </xsd:element>
+    <xsd:element name="MediaServiceFastMetadata" ma:index="11" nillable="true" ma:displayName="MediaServiceFastMetadata" ma:hidden="true" ma:internalName="MediaServiceFastMetadata" ma:readOnly="true">
+      <xsd:simpleType>
+        <xsd:restriction base="dms:Note"/>
+      </xsd:simpleType>
+    </xsd:element>
+    <xsd:element name="MediaServiceAutoKeyPoints" ma:index="12" nillable="true" ma:displayName="MediaServiceAutoKeyPoints" ma:hidden="true" ma:internalName="MediaServiceAutoKeyPoints" ma:readOnly="true">
+      <xsd:simpleType>
+        <xsd:restriction base="dms:Note"/>
+      </xsd:simpleType>
+    </xsd:element>
+    <xsd:element name="MediaServiceKeyPoints" ma:index="13" nillable="true" ma:displayName="KeyPoints" ma:internalName="MediaServiceKeyPoints" ma:readOnly="true">
+      <xsd:simpleType>
+        <xsd:restriction base="dms:Note">
+          <xsd:maxLength value="255"/>
+        </xsd:restriction>
+      </xsd:simpleType>
+    </xsd:element>
+    <xsd:element name="MediaServiceDateTaken" ma:index="14" nillable="true" ma:displayName="MediaServiceDateTaken" ma:hidden="true" ma:internalName="MediaServiceDateTaken" ma:readOnly="true">
+      <xsd:simpleType>
+        <xsd:restriction base="dms:Text"/>
+      </xsd:simpleType>
+    </xsd:element>
+    <xsd:element name="MediaServiceAutoTags" ma:index="15" nillable="true" ma:displayName="Tags" ma:internalName="MediaServiceAutoTags" ma:readOnly="true">
+      <xsd:simpleType>
+        <xsd:restriction base="dms:Text"/>
+      </xsd:simpleType>
+    </xsd:element>
+    <xsd:element name="MediaServiceGenerationTime" ma:index="16" nillable="true" ma:displayName="MediaServiceGenerationTime" ma:hidden="true" ma:internalName="MediaServiceGenerationTime" ma:readOnly="true">
+      <xsd:simpleType>
+        <xsd:restriction base="dms:Text"/>
+      </xsd:simpleType>
+    </xsd:element>
+    <xsd:element name="MediaServiceEventHashCode" ma:index="17" nillable="true" ma:displayName="MediaServiceEventHashCode" ma:hidden="true" ma:internalName="MediaServiceEventHashCode" ma:readOnly="true">
+      <xsd:simpleType>
+        <xsd:restriction base="dms:Text"/>
+      </xsd:simpleType>
+    </xsd:element>
+    <xsd:element name="MediaServiceOCR" ma:index="18" nillable="true" ma:displayName="Extracted Text" ma:internalName="MediaServiceOCR" ma:readOnly="true">
+      <xsd:simpleType>
+        <xsd:restriction base="dms:Note">
+          <xsd:maxLength value="255"/>
+        </xsd:restriction>
+      </xsd:simpleType>
+    </xsd:element>
+    <xsd:element name="MediaServiceObjectDetectorVersions" ma:index="19" nillable="true" ma:displayName="MediaServiceObjectDetectorVersions" ma:hidden="true" ma:indexed="true" ma:internalName="MediaServiceObjectDetectorVersions" ma:readOnly="true">
+      <xsd:simpleType>
+        <xsd:restriction base="dms:Text"/>
+      </xsd:simpleType>
+    </xsd:element>
+    <xsd:element name="MediaLengthInSeconds" ma:index="20" nillable="true" ma:displayName="MediaLengthInSeconds" ma:hidden="true" ma:internalName="MediaLengthInSeconds" ma:readOnly="true">
+      <xsd:simpleType>
+        <xsd:restriction base="dms:Unknown"/>
+      </xsd:simpleType>
+    </xsd:element>
+    <xsd:element name="MediaServiceSearchProperties" ma:index="21" nillable="true" ma:displayName="MediaServiceSearchProperties" ma:hidden="true" ma:internalName="MediaServiceSearchProperties" ma:readOnly="true">
+      <xsd:simpleType>
+        <xsd:restriction base="dms:Note"/>
+      </xsd:simpleType>
+    </xsd:element>
+    <xsd:element name="lcf76f155ced4ddcb4097134ff3c332f" ma:index="23" nillable="true" ma:taxonomy="true" ma:internalName="lcf76f155ced4ddcb4097134ff3c332f" ma:taxonomyFieldName="MediaServiceImageTags" ma:displayName="Image Tags" ma:readOnly="false" ma:fieldId="{5cf76f15-5ced-4ddc-b409-7134ff3c332f}" ma:taxonomyMulti="true" ma:sspId="1ede0447-f3d7-4d1b-893b-1d8d6f43358c" ma:termSetId="09814cd3-568e-fe90-9814-8d621ff8fb84" ma:anchorId="fba54fb3-c3e1-fe81-a776-ca4b69148c4d" ma:open="true" ma:isKeyword="false">
+      <xsd:complexType>
+        <xsd:sequence>
+          <xsd:element ref="pc:Terms" minOccurs="0" maxOccurs="1"/>
+        </xsd:sequence>
+      </xsd:complexType>
+    </xsd:element>
+    <xsd:element name="MediaServiceLocation" ma:index="25" nillable="true" ma:displayName="Location" ma:indexed="true" ma:internalName="MediaServiceLocation" ma:readOnly="true">
+      <xsd:simpleType>
+        <xsd:restriction base="dms:Text"/>
+      </xsd:simpleType>
+    </xsd:element>
+    <xsd:element name="MediaServiceBillingMetadata" ma:index="26" nillable="true" ma:displayName="MediaServiceBillingMetadata" ma:hidden="true" ma:internalName="MediaServiceBillingMetadata" ma:readOnly="true">
+      <xsd:simpleType>
+        <xsd:restriction base="dms:Note"/>
+      </xsd:simpleType>
+    </xsd:element>
+  </xsd:schema>
+  <xsd:schema xmlns="http://schemas.openxmlformats.org/package/2006/metadata/core-properties" xmlns:xsd="http://www.w3.org/2001/XMLSchema" xmlns:xsi="http://www.w3.org/2001/XMLSchema-instance" xmlns:dc="http://purl.org/dc/elements/1.1/" xmlns:dcterms="http://purl.org/dc/terms/" xmlns:odoc="http://schemas.microsoft.com/internal/obd" targetNamespace="http://schemas.openxmlformats.org/package/2006/metadata/core-properties" elementFormDefault="qualified" attributeFormDefault="unqualified" blockDefault="#all">
+    <xsd:import namespace="http://purl.org/dc/elements/1.1/" schemaLocation="http://dublincore.org/schemas/xmls/qdc/2003/04/02/dc.xsd"/>
+    <xsd:import namespace="http://purl.org/dc/terms/" schemaLocation="http://dublincore.org/schemas/xmls/qdc/2003/04/02/dcterms.xsd"/>
+    <xsd:element name="coreProperties" type="CT_coreProperties"/>
+    <xsd:complexType name="CT_coreProperties">
+      <xsd:all>
+        <xsd:element ref="dc:creator" minOccurs="0" maxOccurs="1"/>
+        <xsd:element ref="dcterms:created" minOccurs="0" maxOccurs="1"/>
+        <xsd:element ref="dc:identifier" minOccurs="0" maxOccurs="1"/>
+        <xsd:element name="contentType" minOccurs="0" maxOccurs="1" type="xsd:string" ma:index="0" ma:displayName="Content Type"/>
+        <xsd:element ref="dc:title" minOccurs="0" maxOccurs="1" ma:index="4" ma:displayName="Title"/>
+        <xsd:element ref="dc:subject" minOccurs="0" maxOccurs="1"/>
+        <xsd:element ref="dc:description" minOccurs="0" maxOccurs="1"/>
+        <xsd:element name="keywords" minOccurs="0" maxOccurs="1" type="xsd:string"/>
+        <xsd:element ref="dc:language" minOccurs="0" maxOccurs="1"/>
+        <xsd:element name="category" minOccurs="0" maxOccurs="1" type="xsd:string"/>
+        <xsd:element name="version" minOccurs="0" maxOccurs="1" type="xsd:string"/>
+        <xsd:element name="revision" minOccurs="0" maxOccurs="1" type="xsd:string">
+          <xsd:annotation>
+            <xsd:documentation>
+                        This value indicates the number of saves or revisions. The application is responsible for updating this value after each revision.
+                    </xsd:documentation>
+          </xsd:annotation>
+        </xsd:element>
+        <xsd:element name="lastModifiedBy" minOccurs="0" maxOccurs="1" type="xsd:string"/>
+        <xsd:element ref="dcterms:modified" minOccurs="0" maxOccurs="1"/>
+        <xsd:element name="contentStatus" minOccurs="0" maxOccurs="1" type="xsd:string"/>
+      </xsd:all>
+    </xsd:complexType>
+  </xsd:schema>
+  <xs:schema xmlns:pc="http://schemas.microsoft.com/office/infopath/2007/PartnerControls" xmlns:xs="http://www.w3.org/2001/XMLSchema" targetNamespace="http://schemas.microsoft.com/office/infopath/2007/PartnerControls" elementFormDefault="qualified" attributeFormDefault="unqualified">
+    <xs:element name="Person">
+      <xs:complexType>
+        <xs:sequence>
+          <xs:element ref="pc:DisplayName" minOccurs="0"/>
+          <xs:element ref="pc:AccountId" minOccurs="0"/>
+          <xs:element ref="pc:AccountType" minOccurs="0"/>
+        </xs:sequence>
+      </xs:complexType>
+    </xs:element>
+    <xs:element name="DisplayName" type="xs:string"/>
+    <xs:element name="AccountId" type="xs:string"/>
+    <xs:element name="AccountType" type="xs:string"/>
+    <xs:element name="BDCAssociatedEntity">
+      <xs:complexType>
+        <xs:sequence>
+          <xs:element ref="pc:BDCEntity" minOccurs="0" maxOccurs="unbounded"/>
+        </xs:sequence>
+        <xs:attribute ref="pc:EntityNamespace"/>
+        <xs:attribute ref="pc:EntityName"/>
+        <xs:attribute ref="pc:SystemInstanceName"/>
+        <xs:attribute ref="pc:AssociationName"/>
+      </xs:complexType>
+    </xs:element>
+    <xs:attribute name="EntityNamespace" type="xs:string"/>
+    <xs:attribute name="EntityName" type="xs:string"/>
+    <xs:attribute name="SystemInstanceName" type="xs:string"/>
+    <xs:attribute name="AssociationName" type="xs:string"/>
+    <xs:element name="BDCEntity">
+      <xs:complexType>
+        <xs:sequence>
+          <xs:element ref="pc:EntityDisplayName" minOccurs="0"/>
+          <xs:element ref="pc:EntityInstanceReference" minOccurs="0"/>
+          <xs:element ref="pc:EntityId1" minOccurs="0"/>
+          <xs:element ref="pc:EntityId2" minOccurs="0"/>
+          <xs:element ref="pc:EntityId3" minOccurs="0"/>
+          <xs:element ref="pc:EntityId4" minOccurs="0"/>
+          <xs:element ref="pc:EntityId5" minOccurs="0"/>
+        </xs:sequence>
+      </xs:complexType>
+    </xs:element>
+    <xs:element name="EntityDisplayName" type="xs:string"/>
+    <xs:element name="EntityInstanceReference" type="xs:string"/>
+    <xs:element name="EntityId1" type="xs:string"/>
+    <xs:element name="EntityId2" type="xs:string"/>
+    <xs:element name="EntityId3" type="xs:string"/>
+    <xs:element name="EntityId4" type="xs:string"/>
+    <xs:element name="EntityId5" type="xs:string"/>
+    <xs:element name="Terms">
+      <xs:complexType>
+        <xs:sequence>
+          <xs:element ref="pc:TermInfo" minOccurs="0" maxOccurs="unbounded"/>
+        </xs:sequence>
+      </xs:complexType>
+    </xs:element>
+    <xs:element name="TermInfo">
+      <xs:complexType>
+        <xs:sequence>
+          <xs:element ref="pc:TermName" minOccurs="0"/>
+          <xs:element ref="pc:TermId" minOccurs="0"/>
+        </xs:sequence>
+      </xs:complexType>
+    </xs:element>
+    <xs:element name="TermName" type="xs:string"/>
+    <xs:element name="TermId" type="xs:string"/>
+  </xs:schema>
+</ct:contentTypeSchema>
+</file>
+
+<file path=customXml/item2.xml><?xml version="1.0" encoding="utf-8"?>
+<?mso-contentType ?>
+<FormTemplates xmlns="http://schemas.microsoft.com/sharepoint/v3/contenttype/forms">
+  <Display>DocumentLibraryForm</Display>
+  <Edit>DocumentLibraryForm</Edit>
+  <New>DocumentLibraryForm</New>
+</FormTemplates>
+</file>
+
+<file path=customXml/item3.xml><?xml version="1.0" encoding="utf-8"?>
+<p:properties xmlns:p="http://schemas.microsoft.com/office/2006/metadata/properties" xmlns:xsi="http://www.w3.org/2001/XMLSchema-instance" xmlns:pc="http://schemas.microsoft.com/office/infopath/2007/PartnerControls">
+  <documentManagement>
+    <TaxCatchAll xmlns="0fc475c1-99c8-4a27-b640-1b405f183953" xsi:nil="true"/>
+    <lcf76f155ced4ddcb4097134ff3c332f xmlns="23ce4f88-cd98-46c7-a231-3c68dd29b0d7">
+      <Terms xmlns="http://schemas.microsoft.com/office/infopath/2007/PartnerControls"/>
+    </lcf76f155ced4ddcb4097134ff3c332f>
+  </documentManagement>
+</p:properties>
+</file>
+
+<file path=customXml/itemProps1.xml><?xml version="1.0" encoding="utf-8"?>
+<ds:datastoreItem xmlns:ds="http://schemas.openxmlformats.org/officeDocument/2006/customXml" ds:itemID="{B8C83D53-9E04-4522-BC25-9ABD5EB71A1C}"/>
+</file>
+
+<file path=customXml/itemProps2.xml><?xml version="1.0" encoding="utf-8"?>
+<ds:datastoreItem xmlns:ds="http://schemas.openxmlformats.org/officeDocument/2006/customXml" ds:itemID="{8D5B6878-469A-4B60-998B-9702BD32B9BE}"/>
+</file>
+
+<file path=customXml/itemProps3.xml><?xml version="1.0" encoding="utf-8"?>
+<ds:datastoreItem xmlns:ds="http://schemas.openxmlformats.org/officeDocument/2006/customXml" ds:itemID="{439C65E3-FBD4-42DD-A22B-C05F66E5A302}"/>
 </file>
</xml_diff>

<commit_message>
made the gui more modern
</commit_message>
<xml_diff>
--- a/user_guide/WORKBOOK_CREATOR user guide.docx
+++ b/user_guide/WORKBOOK_CREATOR user guide.docx
@@ -1,6 +1,6 @@
 
 <file path=word/document.xml><?xml version="1.0" encoding="utf-8"?>
-<w:document xmlns:wpc="http://schemas.microsoft.com/office/word/2010/wordprocessingCanvas" xmlns:cx="http://schemas.microsoft.com/office/drawing/2014/chartex" xmlns:cx1="http://schemas.microsoft.com/office/drawing/2015/9/8/chartex" xmlns:cx2="http://schemas.microsoft.com/office/drawing/2015/10/21/chartex" xmlns:cx3="http://schemas.microsoft.com/office/drawing/2016/5/9/chartex" xmlns:cx4="http://schemas.microsoft.com/office/drawing/2016/5/10/chartex" xmlns:cx5="http://schemas.microsoft.com/office/drawing/2016/5/11/chartex" xmlns:cx6="http://schemas.microsoft.com/office/drawing/2016/5/12/chartex" xmlns:cx7="http://schemas.microsoft.com/office/drawing/2016/5/13/chartex" xmlns:cx8="http://schemas.microsoft.com/office/drawing/2016/5/14/chartex" xmlns:mc="http://schemas.openxmlformats.org/markup-compatibility/2006" xmlns:aink="http://schemas.microsoft.com/office/drawing/2016/ink" xmlns:am3d="http://schemas.microsoft.com/office/drawing/2017/model3d" xmlns:o="urn:schemas-microsoft-com:office:office" xmlns:oel="http://schemas.microsoft.com/office/2019/extlst" xmlns:r="http://schemas.openxmlformats.org/officeDocument/2006/relationships" xmlns:m="http://schemas.openxmlformats.org/officeDocument/2006/math" xmlns:v="urn:schemas-microsoft-com:vml" xmlns:wp14="http://schemas.microsoft.com/office/word/2010/wordprocessingDrawing" xmlns:wp="http://schemas.openxmlformats.org/drawingml/2006/wordprocessingDrawing" xmlns:w10="urn:schemas-microsoft-com:office:word" xmlns:w="http://schemas.openxmlformats.org/wordprocessingml/2006/main" xmlns:w14="http://schemas.microsoft.com/office/word/2010/wordml" xmlns:w15="http://schemas.microsoft.com/office/word/2012/wordml" xmlns:w16cex="http://schemas.microsoft.com/office/word/2018/wordml/cex" xmlns:w16cid="http://schemas.microsoft.com/office/word/2016/wordml/cid" xmlns:w16="http://schemas.microsoft.com/office/word/2018/wordml" xmlns:w16du="http://schemas.microsoft.com/office/word/2023/wordml/word16du" xmlns:w16sdtdh="http://schemas.microsoft.com/office/word/2020/wordml/sdtdatahash" xmlns:w16sdtfl="http://schemas.microsoft.com/office/word/2024/wordml/sdtformatlock" xmlns:w16se="http://schemas.microsoft.com/office/word/2015/wordml/symex" xmlns:wpg="http://schemas.microsoft.com/office/word/2010/wordprocessingGroup" xmlns:wpi="http://schemas.microsoft.com/office/word/2010/wordprocessingInk" xmlns:wne="http://schemas.microsoft.com/office/word/2006/wordml" xmlns:wps="http://schemas.microsoft.com/office/word/2010/wordprocessingShape" xmlns:a="http://schemas.openxmlformats.org/drawingml/2006/main" xmlns:pic="http://schemas.openxmlformats.org/drawingml/2006/picture" xmlns:a14="http://schemas.microsoft.com/office/drawing/2010/main" mc:Ignorable="w14 w15 w16se w16cid w16 w16cex w16sdtdh w16sdtfl w16du wp14">
+<w:document xmlns:wpc="http://schemas.microsoft.com/office/word/2010/wordprocessingCanvas" xmlns:cx="http://schemas.microsoft.com/office/drawing/2014/chartex" xmlns:cx1="http://schemas.microsoft.com/office/drawing/2015/9/8/chartex" xmlns:cx2="http://schemas.microsoft.com/office/drawing/2015/10/21/chartex" xmlns:cx3="http://schemas.microsoft.com/office/drawing/2016/5/9/chartex" xmlns:cx4="http://schemas.microsoft.com/office/drawing/2016/5/10/chartex" xmlns:cx5="http://schemas.microsoft.com/office/drawing/2016/5/11/chartex" xmlns:cx6="http://schemas.microsoft.com/office/drawing/2016/5/12/chartex" xmlns:cx7="http://schemas.microsoft.com/office/drawing/2016/5/13/chartex" xmlns:cx8="http://schemas.microsoft.com/office/drawing/2016/5/14/chartex" xmlns:mc="http://schemas.openxmlformats.org/markup-compatibility/2006" xmlns:aink="http://schemas.microsoft.com/office/drawing/2016/ink" xmlns:am3d="http://schemas.microsoft.com/office/drawing/2017/model3d" xmlns:o="urn:schemas-microsoft-com:office:office" xmlns:oel="http://schemas.microsoft.com/office/2019/extlst" xmlns:r="http://schemas.openxmlformats.org/officeDocument/2006/relationships" xmlns:m="http://schemas.openxmlformats.org/officeDocument/2006/math" xmlns:v="urn:schemas-microsoft-com:vml" xmlns:wp14="http://schemas.microsoft.com/office/word/2010/wordprocessingDrawing" xmlns:wp="http://schemas.openxmlformats.org/drawingml/2006/wordprocessingDrawing" xmlns:w10="urn:schemas-microsoft-com:office:word" xmlns:w="http://schemas.openxmlformats.org/wordprocessingml/2006/main" xmlns:w14="http://schemas.microsoft.com/office/word/2010/wordml" xmlns:w15="http://schemas.microsoft.com/office/word/2012/wordml" xmlns:w16cex="http://schemas.microsoft.com/office/word/2018/wordml/cex" xmlns:w16cid="http://schemas.microsoft.com/office/word/2016/wordml/cid" xmlns:w16="http://schemas.microsoft.com/office/word/2018/wordml" xmlns:w16du="http://schemas.microsoft.com/office/word/2023/wordml/word16du" xmlns:w16sdtdh="http://schemas.microsoft.com/office/word/2020/wordml/sdtdatahash" xmlns:w16sdtfl="http://schemas.microsoft.com/office/word/2024/wordml/sdtformatlock" xmlns:w16se="http://schemas.microsoft.com/office/word/2015/wordml/symex" xmlns:wpg="http://schemas.microsoft.com/office/word/2010/wordprocessingGroup" xmlns:wpi="http://schemas.microsoft.com/office/word/2010/wordprocessingInk" xmlns:wne="http://schemas.microsoft.com/office/word/2006/wordml" xmlns:wps="http://schemas.microsoft.com/office/word/2010/wordprocessingShape" mc:Ignorable="w14 w15 w16se w16cid w16 w16cex w16sdtdh w16sdtfl w16du wp14">
   <w:body>
     <w:p>
       <w:pPr>
@@ -26,112 +26,93 @@
     </w:p>
     <w:p>
       <w:r>
-        <w:rPr/>
         <w:t xml:space="preserve">For this program to </w:t>
       </w:r>
       <w:r>
-        <w:rPr/>
         <w:t>work,</w:t>
       </w:r>
       <w:r>
-        <w:rPr/>
-        <w:t xml:space="preserve"> the directory should </w:t>
-      </w:r>
-      <w:r>
-        <w:rPr/>
-        <w:t>contain</w:t>
-      </w:r>
-      <w:r>
-        <w:rPr/>
-        <w:t xml:space="preserve"> an </w:t>
-      </w:r>
-      <w:r>
-        <w:rPr>
-          <w:i w:val="1"/>
-          <w:iCs w:val="1"/>
+        <w:t xml:space="preserve"> the directory should contain an </w:t>
+      </w:r>
+      <w:proofErr w:type="spellStart"/>
+      <w:r>
+        <w:rPr>
+          <w:i/>
+          <w:iCs/>
         </w:rPr>
         <w:t>img</w:t>
       </w:r>
-      <w:r>
-        <w:rPr>
-          <w:i w:val="1"/>
-          <w:iCs w:val="1"/>
+      <w:proofErr w:type="spellEnd"/>
+      <w:r>
+        <w:rPr>
+          <w:i/>
+          <w:iCs/>
         </w:rPr>
         <w:t xml:space="preserve"> </w:t>
       </w:r>
       <w:r>
-        <w:rPr/>
         <w:t xml:space="preserve">folder with a </w:t>
       </w:r>
       <w:r>
         <w:rPr>
-          <w:i w:val="1"/>
-          <w:iCs w:val="1"/>
+          <w:i/>
+          <w:iCs/>
         </w:rPr>
         <w:t>logo.ico</w:t>
       </w:r>
       <w:r>
-        <w:rPr/>
         <w:t xml:space="preserve"> file, </w:t>
       </w:r>
       <w:r>
-        <w:rPr/>
         <w:t xml:space="preserve">a </w:t>
       </w:r>
       <w:r>
-        <w:rPr/>
         <w:t xml:space="preserve">configuration file titled </w:t>
       </w:r>
       <w:r>
         <w:rPr>
-          <w:i w:val="1"/>
-          <w:iCs w:val="1"/>
+          <w:i/>
+          <w:iCs/>
         </w:rPr>
         <w:t>config.ini</w:t>
       </w:r>
       <w:r>
-        <w:rPr/>
         <w:t>,</w:t>
       </w:r>
       <w:r>
         <w:rPr>
-          <w:i w:val="1"/>
-          <w:iCs w:val="1"/>
+          <w:i/>
+          <w:iCs/>
         </w:rPr>
         <w:t xml:space="preserve"> </w:t>
       </w:r>
       <w:r>
-        <w:rPr/>
         <w:t xml:space="preserve">an optional </w:t>
       </w:r>
       <w:r>
         <w:rPr>
-          <w:i w:val="1"/>
-          <w:iCs w:val="1"/>
+          <w:i/>
+          <w:iCs/>
         </w:rPr>
         <w:t>lot.csv</w:t>
       </w:r>
       <w:r>
-        <w:rPr/>
         <w:t xml:space="preserve"> and the executable </w:t>
       </w:r>
       <w:r>
         <w:rPr>
-          <w:i w:val="1"/>
-          <w:iCs w:val="1"/>
+          <w:i/>
+          <w:iCs/>
         </w:rPr>
         <w:t>WORKBOOK_CREATOR.EXE</w:t>
       </w:r>
       <w:r>
-        <w:rPr/>
         <w:t xml:space="preserve"> file itself.</w:t>
       </w:r>
       <w:r>
-        <w:rPr/>
         <w:t xml:space="preserve"> Launching the application displays the graphical user interface</w:t>
       </w:r>
       <w:r>
-        <w:rPr/>
         <w:t xml:space="preserve"> below:</w:t>
       </w:r>
     </w:p>
@@ -161,7 +142,7 @@
                     </pic:cNvPicPr>
                   </pic:nvPicPr>
                   <pic:blipFill>
-                    <a:blip r:embed="rId6">
+                    <a:blip r:embed="rId9">
                       <a:extLst>
                         <a:ext uri="{28A0092B-C50C-407E-A947-70E740481C1C}">
                           <a14:useLocalDpi xmlns:a14="http://schemas.microsoft.com/office/drawing/2010/main" val="0"/>
@@ -278,40 +259,25 @@
         </w:tabs>
       </w:pPr>
       <w:r>
-        <w:rPr/>
         <w:t>You are presented with an interface to input the request id, samples</w:t>
       </w:r>
       <w:r>
-        <w:rPr/>
         <w:t>, and a</w:t>
       </w:r>
       <w:r>
-        <w:rPr/>
         <w:t xml:space="preserve"> check box to apply a L.O.I correction for the analysis and a set of radio buttons to set the samples as duplicate or triplicate.</w:t>
       </w:r>
       <w:r>
-        <w:rPr/>
         <w:t xml:space="preserve"> After filling out the information about the request</w:t>
       </w:r>
       <w:r>
-        <w:rPr/>
         <w:t>,</w:t>
       </w:r>
       <w:r>
-        <w:rPr/>
         <w:t xml:space="preserve"> you then input the metals analyzed and their respective digestion method.</w:t>
       </w:r>
       <w:r>
-        <w:rPr/>
-        <w:t xml:space="preserve"> </w:t>
-      </w:r>
-      <w:r>
-        <w:rPr/>
-        <w:t>I’ve</w:t>
-      </w:r>
-      <w:r>
-        <w:rPr/>
-        <w:t xml:space="preserve"> attached a sample request report to walkthrough building a workbook.</w:t>
+        <w:t xml:space="preserve"> I’ve attached a sample request report to walkthrough building a workbook.</w:t>
       </w:r>
     </w:p>
     <w:p>
@@ -344,7 +310,7 @@
                     </pic:cNvPicPr>
                   </pic:nvPicPr>
                   <pic:blipFill>
-                    <a:blip r:embed="rId7" cstate="print">
+                    <a:blip r:embed="rId10" cstate="print">
                       <a:extLst>
                         <a:ext uri="{28A0092B-C50C-407E-A947-70E740481C1C}">
                           <a14:useLocalDpi xmlns:a14="http://schemas.microsoft.com/office/drawing/2010/main" val="0"/>
@@ -455,100 +421,59 @@
         </w:tabs>
       </w:pPr>
       <w:r>
-        <w:rPr/>
-        <w:t xml:space="preserve">Note that this sample request </w:t>
-      </w:r>
-      <w:r>
-        <w:rPr/>
-        <w:t>contains</w:t>
-      </w:r>
-      <w:r>
-        <w:rPr/>
-        <w:t xml:space="preserve"> Al2O3, CaO for all 4 </w:t>
-      </w:r>
-      <w:r>
-        <w:rPr/>
+        <w:t xml:space="preserve">Note that this sample request contains Al2O3, CaO for all 4 </w:t>
+      </w:r>
+      <w:r>
         <w:t>samples,</w:t>
       </w:r>
       <w:r>
-        <w:rPr/>
-        <w:t xml:space="preserve"> but only sample 200127536 </w:t>
-      </w:r>
-      <w:r>
-        <w:rPr/>
-        <w:t>contains</w:t>
-      </w:r>
-      <w:r>
-        <w:rPr/>
-        <w:t xml:space="preserve"> TiO2.</w:t>
-      </w:r>
-      <w:r>
-        <w:rPr/>
+        <w:t xml:space="preserve"> but only sample 200127536 contains TiO2.</w:t>
+      </w:r>
+      <w:r>
         <w:t xml:space="preserve"> To build this </w:t>
       </w:r>
       <w:r>
-        <w:rPr/>
         <w:t>sheet,</w:t>
       </w:r>
       <w:r>
-        <w:rPr/>
-        <w:t xml:space="preserve"> </w:t>
-      </w:r>
-      <w:r>
-        <w:rPr/>
-        <w:t>a separate</w:t>
-      </w:r>
-      <w:r>
-        <w:rPr/>
-        <w:t xml:space="preserve"> digestion needs to be created to capture TiO2.</w:t>
-      </w:r>
-      <w:r>
-        <w:rPr/>
+        <w:t xml:space="preserve"> a separate digestion needs to be created to capture TiO2.</w:t>
+      </w:r>
+      <w:r>
         <w:t xml:space="preserve"> Samples can </w:t>
       </w:r>
       <w:r>
-        <w:rPr/>
         <w:t xml:space="preserve">be </w:t>
       </w:r>
       <w:r>
-        <w:rPr/>
         <w:t>inputted</w:t>
       </w:r>
       <w:r>
-        <w:rPr/>
-        <w:t xml:space="preserve"> as a comma or white space separated list; </w:t>
-      </w:r>
-      <w:r>
-        <w:rPr/>
-        <w:t>I’ve</w:t>
-      </w:r>
-      <w:r>
-        <w:rPr/>
-        <w:t xml:space="preserve"> also included a shortcut if all the samples in the analysis are sequential. </w:t>
-      </w:r>
-      <w:r>
-        <w:rPr>
-          <w:i w:val="1"/>
-          <w:iCs w:val="1"/>
+        <w:t xml:space="preserve"> as a comma or white space separated list; I’ve also included a shortcut if all the samples in the analysis are sequential. </w:t>
+      </w:r>
+      <w:r>
+        <w:rPr>
+          <w:i/>
+          <w:iCs/>
         </w:rPr>
         <w:t>shortcut=</w:t>
       </w:r>
-      <w:r>
-        <w:rPr>
-          <w:i w:val="1"/>
-          <w:iCs w:val="1"/>
+      <w:proofErr w:type="spellStart"/>
+      <w:r>
+        <w:rPr>
+          <w:i/>
+          <w:iCs/>
         </w:rPr>
         <w:t>leading_sample_id</w:t>
       </w:r>
-      <w:r>
-        <w:rPr>
-          <w:i w:val="1"/>
-          <w:iCs w:val="1"/>
+      <w:proofErr w:type="spellEnd"/>
+      <w:r>
+        <w:rPr>
+          <w:i/>
+          <w:iCs/>
         </w:rPr>
         <w:t>(n)</w:t>
       </w:r>
       <w:r>
-        <w:rPr/>
         <w:t>, so in our case: 200127533(4) = 200127533, 200127534, 200127535, 200127536.</w:t>
       </w:r>
     </w:p>
@@ -582,7 +507,7 @@
                     </pic:cNvPicPr>
                   </pic:nvPicPr>
                   <pic:blipFill>
-                    <a:blip r:embed="rId8">
+                    <a:blip r:embed="rId11">
                       <a:extLst>
                         <a:ext uri="{28A0092B-C50C-407E-A947-70E740481C1C}">
                           <a14:useLocalDpi xmlns:a14="http://schemas.microsoft.com/office/drawing/2010/main" val="0"/>
@@ -623,40 +548,40 @@
       </w:pPr>
       <w:r>
         <w:rPr>
-          <w:b w:val="1"/>
-          <w:bCs w:val="1"/>
+          <w:b/>
+          <w:bCs/>
           <w:color w:val="FF0000"/>
         </w:rPr>
         <w:t xml:space="preserve">Figure </w:t>
       </w:r>
       <w:r>
         <w:rPr>
-          <w:b w:val="1"/>
-          <w:bCs w:val="1"/>
+          <w:b/>
+          <w:bCs/>
           <w:color w:val="FF0000"/>
         </w:rPr>
         <w:fldChar w:fldCharType="begin"/>
       </w:r>
       <w:r>
         <w:rPr>
-          <w:b w:val="1"/>
-          <w:bCs w:val="1"/>
+          <w:b/>
+          <w:bCs/>
           <w:color w:val="FF0000"/>
         </w:rPr>
         <w:instrText xml:space="preserve"> SEQ Figure \* ARABIC </w:instrText>
       </w:r>
       <w:r>
         <w:rPr>
-          <w:b w:val="1"/>
-          <w:bCs w:val="1"/>
+          <w:b/>
+          <w:bCs/>
           <w:color w:val="FF0000"/>
         </w:rPr>
         <w:fldChar w:fldCharType="separate"/>
       </w:r>
       <w:r>
         <w:rPr>
-          <w:b w:val="1"/>
-          <w:bCs w:val="1"/>
+          <w:b/>
+          <w:bCs/>
           <w:noProof/>
           <w:color w:val="FF0000"/>
         </w:rPr>
@@ -664,16 +589,16 @@
       </w:r>
       <w:r>
         <w:rPr>
-          <w:b w:val="1"/>
-          <w:bCs w:val="1"/>
+          <w:b/>
+          <w:bCs/>
           <w:color w:val="FF0000"/>
         </w:rPr>
         <w:fldChar w:fldCharType="end"/>
       </w:r>
       <w:r>
         <w:rPr>
-          <w:b w:val="1"/>
-          <w:bCs w:val="1"/>
+          <w:b/>
+          <w:bCs/>
           <w:color w:val="FF0000"/>
         </w:rPr>
         <w:t>:</w:t>
@@ -704,90 +629,68 @@
         </w:tabs>
       </w:pPr>
       <w:r>
-        <w:rPr/>
         <w:t xml:space="preserve">Note the separate Ti </w:t>
       </w:r>
-      <w:r>
-        <w:rPr/>
+      <w:proofErr w:type="spellStart"/>
+      <w:r>
         <w:t>Katanax</w:t>
       </w:r>
-      <w:r>
-        <w:rPr/>
+      <w:proofErr w:type="spellEnd"/>
+      <w:r>
         <w:t xml:space="preserve"> digestion to capture Ti for sample </w:t>
       </w:r>
       <w:r>
-        <w:rPr/>
         <w:t>200127536;</w:t>
       </w:r>
       <w:r>
-        <w:rPr/>
         <w:t xml:space="preserve"> </w:t>
       </w:r>
       <w:r>
-        <w:rPr/>
         <w:t>all</w:t>
       </w:r>
       <w:r>
-        <w:rPr/>
         <w:t xml:space="preserve"> the other samples are preselected</w:t>
       </w:r>
       <w:r>
-        <w:rPr/>
         <w:t xml:space="preserve"> </w:t>
       </w:r>
       <w:r>
-        <w:rPr/>
         <w:t xml:space="preserve">for the Al, Ca </w:t>
       </w:r>
-      <w:r>
-        <w:rPr/>
+      <w:proofErr w:type="spellStart"/>
+      <w:r>
         <w:t>Katanax</w:t>
       </w:r>
-      <w:r>
-        <w:rPr/>
+      <w:proofErr w:type="spellEnd"/>
+      <w:r>
         <w:t xml:space="preserve"> digestion.</w:t>
       </w:r>
       <w:r>
-        <w:rPr/>
         <w:t xml:space="preserve"> Once all the pertinent info is put into the </w:t>
       </w:r>
       <w:r>
-        <w:rPr/>
         <w:t>application,</w:t>
       </w:r>
       <w:r>
-        <w:rPr/>
-        <w:t xml:space="preserve"> click on the </w:t>
-      </w:r>
-      <w:r>
-        <w:rPr/>
-        <w:t>submit</w:t>
-      </w:r>
-      <w:r>
-        <w:rPr/>
-        <w:t xml:space="preserve"> button to create </w:t>
-      </w:r>
-      <w:r>
-        <w:rPr>
-          <w:i w:val="1"/>
-          <w:iCs w:val="1"/>
+        <w:t xml:space="preserve"> click on the submit button to create </w:t>
+      </w:r>
+      <w:r>
+        <w:rPr>
+          <w:i/>
+          <w:iCs/>
         </w:rPr>
         <w:t>master_woorkbook.xlsx</w:t>
       </w:r>
       <w:r>
-        <w:rPr/>
         <w:t>. You are</w:t>
       </w:r>
       <w:r>
-        <w:rPr/>
         <w:t xml:space="preserve"> </w:t>
       </w:r>
       <w:r>
-        <w:rPr/>
         <w:t>then presented</w:t>
       </w:r>
       <w:r>
-        <w:rPr/>
         <w:t xml:space="preserve"> with a workbook with a digestion page and a tab for each of the samples.</w:t>
       </w:r>
     </w:p>
@@ -821,7 +724,7 @@
                     </pic:cNvPicPr>
                   </pic:nvPicPr>
                   <pic:blipFill>
-                    <a:blip r:embed="rId9">
+                    <a:blip r:embed="rId12">
                       <a:extLst>
                         <a:ext uri="{28A0092B-C50C-407E-A947-70E740481C1C}">
                           <a14:useLocalDpi xmlns:a14="http://schemas.microsoft.com/office/drawing/2010/main" val="0"/>
@@ -889,7 +792,21 @@
         <w:rPr>
           <w:color w:val="FF0000"/>
         </w:rPr>
-        <w:t xml:space="preserve"> digestion page.</w:t>
+        <w:t xml:space="preserve"> </w:t>
+      </w:r>
+      <w:proofErr w:type="gramStart"/>
+      <w:r>
+        <w:rPr>
+          <w:color w:val="FF0000"/>
+        </w:rPr>
+        <w:t>digestion</w:t>
+      </w:r>
+      <w:proofErr w:type="gramEnd"/>
+      <w:r>
+        <w:rPr>
+          <w:color w:val="FF0000"/>
+        </w:rPr>
+        <w:t xml:space="preserve"> page.</w:t>
       </w:r>
     </w:p>
     <w:p>
@@ -928,16 +845,16 @@
         </w:rPr>
         <w:lastRenderedPageBreak/>
         <w:drawing>
-          <wp:anchor distT="0" distB="0" distL="114300" distR="114300" simplePos="0" relativeHeight="251669504" behindDoc="0" locked="0" layoutInCell="1" allowOverlap="1" wp14:anchorId="27943104" wp14:editId="32BA9B45">
+          <wp:anchor distT="0" distB="0" distL="114300" distR="114300" simplePos="0" relativeHeight="251669504" behindDoc="0" locked="0" layoutInCell="1" allowOverlap="1" wp14:anchorId="27943104" wp14:editId="0E840DFA">
             <wp:simplePos x="0" y="0"/>
             <wp:positionH relativeFrom="margin">
-              <wp:posOffset>3269753</wp:posOffset>
+              <wp:posOffset>3267986</wp:posOffset>
             </wp:positionH>
             <wp:positionV relativeFrom="paragraph">
-              <wp:posOffset>7620</wp:posOffset>
+              <wp:posOffset>45582</wp:posOffset>
             </wp:positionV>
-            <wp:extent cx="2841158" cy="3824274"/>
-            <wp:effectExtent l="0" t="0" r="0" b="5080"/>
+            <wp:extent cx="2841158" cy="3749011"/>
+            <wp:effectExtent l="0" t="0" r="0" b="4445"/>
             <wp:wrapNone/>
             <wp:docPr id="1035602911" name="Picture 6"/>
             <wp:cNvGraphicFramePr>
@@ -953,7 +870,7 @@
                     </pic:cNvPicPr>
                   </pic:nvPicPr>
                   <pic:blipFill>
-                    <a:blip r:embed="rId10">
+                    <a:blip r:embed="rId13">
                       <a:extLst>
                         <a:ext uri="{28A0092B-C50C-407E-A947-70E740481C1C}">
                           <a14:useLocalDpi xmlns:a14="http://schemas.microsoft.com/office/drawing/2010/main" val="0"/>
@@ -967,7 +884,7 @@
                   <pic:spPr bwMode="auto">
                     <a:xfrm>
                       <a:off x="0" y="0"/>
-                      <a:ext cx="2841158" cy="3824274"/>
+                      <a:ext cx="2841158" cy="3749011"/>
                     </a:xfrm>
                     <a:prstGeom prst="rect">
                       <a:avLst/>
@@ -1052,7 +969,7 @@
               </wp:anchor>
             </w:drawing>
           </mc:Choice>
-          <mc:Fallback>
+          <mc:Fallback xmlns:a14="http://schemas.microsoft.com/office/drawing/2010/main" xmlns:pic="http://schemas.openxmlformats.org/drawingml/2006/picture" xmlns:a="http://schemas.openxmlformats.org/drawingml/2006/main">
             <w:pict>
               <v:shapetype id="_x0000_t202" coordsize="21600,21600" o:spt="202" path="m,l,21600r21600,l21600,xe" w14:anchorId="135A8075">
                 <v:stroke joinstyle="miter"/>
@@ -1098,7 +1015,7 @@
                     </pic:cNvPicPr>
                   </pic:nvPicPr>
                   <pic:blipFill>
-                    <a:blip r:embed="rId11">
+                    <a:blip r:embed="rId14">
                       <a:extLst>
                         <a:ext uri="{28A0092B-C50C-407E-A947-70E740481C1C}">
                           <a14:useLocalDpi xmlns:a14="http://schemas.microsoft.com/office/drawing/2010/main" val="0"/>
@@ -1244,7 +1161,7 @@
               </wp:anchor>
             </w:drawing>
           </mc:Choice>
-          <mc:Fallback>
+          <mc:Fallback xmlns:a14="http://schemas.microsoft.com/office/drawing/2010/main" xmlns:pic="http://schemas.openxmlformats.org/drawingml/2006/picture" xmlns:a="http://schemas.openxmlformats.org/drawingml/2006/main">
             <w:pict>
               <v:shape id="_x0000_s1027" style="position:absolute;margin-left:251.65pt;margin-top:.3pt;width:248.55pt;height:.05pt;z-index:251663360;visibility:visible;mso-wrap-style:square;mso-width-percent:0;mso-wrap-distance-left:9pt;mso-wrap-distance-top:0;mso-wrap-distance-right:9pt;mso-wrap-distance-bottom:0;mso-position-horizontal:absolute;mso-position-horizontal-relative:text;mso-position-vertical:absolute;mso-position-vertical-relative:text;mso-width-percent:0;mso-width-relative:margin;v-text-anchor:top" stroked="f" type="#_x0000_t202" o:gfxdata="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" w14:anchorId="5CB2E506">
                 <v:textbox style="mso-fit-shape-to-text:t" inset="0,0,0,0">
@@ -1358,8 +1275,13 @@
       <w:r>
         <w:t xml:space="preserve">. Note the yellow unfilled </w:t>
       </w:r>
-      <w:r>
-        <w:t xml:space="preserve">ti lot box implies that either the </w:t>
+      <w:proofErr w:type="spellStart"/>
+      <w:r>
+        <w:t>ti</w:t>
+      </w:r>
+      <w:proofErr w:type="spellEnd"/>
+      <w:r>
+        <w:t xml:space="preserve"> lot box implies that either the </w:t>
       </w:r>
       <w:r>
         <w:rPr>
@@ -1369,7 +1291,15 @@
         <w:t>lot.csv</w:t>
       </w:r>
       <w:r>
-        <w:t xml:space="preserve"> does not contain a ti entry or that is expired.</w:t>
+        <w:t xml:space="preserve"> does not contain a </w:t>
+      </w:r>
+      <w:proofErr w:type="spellStart"/>
+      <w:r>
+        <w:t>ti</w:t>
+      </w:r>
+      <w:proofErr w:type="spellEnd"/>
+      <w:r>
+        <w:t xml:space="preserve"> entry or that is expired.</w:t>
       </w:r>
     </w:p>
     <w:p>
@@ -1422,7 +1352,7 @@
                     </pic:cNvPicPr>
                   </pic:nvPicPr>
                   <pic:blipFill>
-                    <a:blip r:embed="rId12">
+                    <a:blip r:embed="rId15">
                       <a:extLst>
                         <a:ext uri="{28A0092B-C50C-407E-A947-70E740481C1C}">
                           <a14:useLocalDpi xmlns:a14="http://schemas.microsoft.com/office/drawing/2010/main" val="0"/>
@@ -1464,24 +1394,24 @@
       </w:pPr>
       <w:r>
         <w:rPr>
-          <w:b w:val="1"/>
-          <w:bCs w:val="1"/>
+          <w:b/>
+          <w:bCs/>
           <w:color w:val="FF0000"/>
         </w:rPr>
         <w:t xml:space="preserve">Figure </w:t>
       </w:r>
       <w:r>
         <w:rPr>
-          <w:b w:val="1"/>
-          <w:bCs w:val="1"/>
+          <w:b/>
+          <w:bCs/>
           <w:color w:val="FF0000"/>
         </w:rPr>
         <w:t>7</w:t>
       </w:r>
       <w:r>
         <w:rPr>
-          <w:b w:val="1"/>
-          <w:bCs w:val="1"/>
+          <w:b/>
+          <w:bCs/>
           <w:color w:val="FF0000"/>
         </w:rPr>
         <w:t>:</w:t>
@@ -1511,48 +1441,35 @@
           <w:tab w:val="left" w:pos="1841"/>
         </w:tabs>
       </w:pPr>
-      <w:r>
-        <w:rPr/>
+      <w:proofErr w:type="gramStart"/>
+      <w:r>
         <w:t>Cr(</w:t>
       </w:r>
-      <w:r>
-        <w:rPr/>
+      <w:proofErr w:type="gramEnd"/>
+      <w:r>
         <w:t xml:space="preserve">III) </w:t>
       </w:r>
       <w:r>
-        <w:rPr/>
         <w:t xml:space="preserve">analyst is a special type of titration analysis that takes the difference </w:t>
       </w:r>
       <w:r>
-        <w:rPr/>
         <w:t>between</w:t>
       </w:r>
       <w:r>
-        <w:rPr/>
         <w:t xml:space="preserve"> Cr2O3 and </w:t>
       </w:r>
-      <w:r>
-        <w:rPr/>
+      <w:proofErr w:type="gramStart"/>
+      <w:r>
         <w:t>Cr(</w:t>
       </w:r>
-      <w:r>
-        <w:rPr/>
-        <w:t xml:space="preserve">VI) titration analysis. </w:t>
-      </w:r>
-      <w:r>
-        <w:rPr/>
-        <w:t>Let’s</w:t>
-      </w:r>
-      <w:r>
-        <w:rPr/>
-        <w:t xml:space="preserve"> walk through ho</w:t>
-      </w:r>
-      <w:r>
-        <w:rPr/>
+      <w:proofErr w:type="gramEnd"/>
+      <w:r>
+        <w:t>VI) titration analysis. Let’s walk through ho</w:t>
+      </w:r>
+      <w:r>
         <w:t>w</w:t>
       </w:r>
       <w:r>
-        <w:rPr/>
         <w:t xml:space="preserve"> to set that up in the program.</w:t>
       </w:r>
     </w:p>
@@ -1641,7 +1558,21 @@
                               <w:rPr>
                                 <w:color w:val="FF0000"/>
                               </w:rPr>
-                              <w:t xml:space="preserve"> Cr(III) analysis.</w:t>
+                              <w:t xml:space="preserve"> </w:t>
+                            </w:r>
+                            <w:proofErr w:type="gramStart"/>
+                            <w:r>
+                              <w:rPr>
+                                <w:color w:val="FF0000"/>
+                              </w:rPr>
+                              <w:t>Cr(</w:t>
+                            </w:r>
+                            <w:proofErr w:type="gramEnd"/>
+                            <w:r>
+                              <w:rPr>
+                                <w:color w:val="FF0000"/>
+                              </w:rPr>
+                              <w:t>III) analysis.</w:t>
                             </w:r>
                           </w:p>
                         </w:txbxContent>
@@ -1658,7 +1589,7 @@
               </wp:anchor>
             </w:drawing>
           </mc:Choice>
-          <mc:Fallback>
+          <mc:Fallback xmlns:a14="http://schemas.microsoft.com/office/drawing/2010/main" xmlns:pic="http://schemas.openxmlformats.org/drawingml/2006/picture" xmlns:a="http://schemas.openxmlformats.org/drawingml/2006/main">
             <w:pict>
               <v:shape id="_x0000_s1028" style="position:absolute;margin-left:250.5pt;margin-top:274.05pt;width:217.25pt;height:.05pt;z-index:251666432;visibility:visible;mso-wrap-style:square;mso-wrap-distance-left:9pt;mso-wrap-distance-top:0;mso-wrap-distance-right:9pt;mso-wrap-distance-bottom:0;mso-position-horizontal:absolute;mso-position-horizontal-relative:text;mso-position-vertical:absolute;mso-position-vertical-relative:text;v-text-anchor:top" stroked="f" type="#_x0000_t202" o:gfxdata="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" w14:anchorId="0FD11C01">
                 <v:textbox style="mso-fit-shape-to-text:t" inset="0,0,0,0">
@@ -1754,7 +1685,7 @@
                     </pic:cNvPicPr>
                   </pic:nvPicPr>
                   <pic:blipFill>
-                    <a:blip r:embed="rId13">
+                    <a:blip r:embed="rId16">
                       <a:extLst>
                         <a:ext uri="{28A0092B-C50C-407E-A947-70E740481C1C}">
                           <a14:useLocalDpi xmlns:a14="http://schemas.microsoft.com/office/drawing/2010/main" val="0"/>
@@ -1807,7 +1738,7 @@
                     </pic:cNvPicPr>
                   </pic:nvPicPr>
                   <pic:blipFill>
-                    <a:blip r:embed="rId14">
+                    <a:blip r:embed="rId17">
                       <a:extLst>
                         <a:ext uri="{28A0092B-C50C-407E-A947-70E740481C1C}">
                           <a14:useLocalDpi xmlns:a14="http://schemas.microsoft.com/office/drawing/2010/main" val="0"/>
@@ -1875,8 +1806,16 @@
         <w:rPr>
           <w:color w:val="FF0000"/>
         </w:rPr>
-        <w:t xml:space="preserve"> Cr(</w:t>
-      </w:r>
+        <w:t xml:space="preserve"> </w:t>
+      </w:r>
+      <w:proofErr w:type="gramStart"/>
+      <w:r>
+        <w:rPr>
+          <w:color w:val="FF0000"/>
+        </w:rPr>
+        <w:t>Cr(</w:t>
+      </w:r>
+      <w:proofErr w:type="gramEnd"/>
       <w:r>
         <w:rPr>
           <w:color w:val="FF0000"/>
@@ -2073,7 +2012,7 @@
               </wp:anchor>
             </w:drawing>
           </mc:Choice>
-          <mc:Fallback>
+          <mc:Fallback xmlns:a14="http://schemas.microsoft.com/office/drawing/2010/main" xmlns:pic="http://schemas.openxmlformats.org/drawingml/2006/picture" xmlns:a="http://schemas.openxmlformats.org/drawingml/2006/main">
             <w:pict>
               <v:shape id="_x0000_s1029" style="position:absolute;margin-left:247pt;margin-top:168.1pt;width:241.65pt;height:.05pt;z-index:251668480;visibility:visible;mso-wrap-style:square;mso-wrap-distance-left:9pt;mso-wrap-distance-top:0;mso-wrap-distance-right:9pt;mso-wrap-distance-bottom:0;mso-position-horizontal:absolute;mso-position-horizontal-relative:text;mso-position-vertical:absolute;mso-position-vertical-relative:text;v-text-anchor:top" stroked="f" type="#_x0000_t202" o:gfxdata="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" w14:anchorId="1FB30C27">
                 <v:textbox style="mso-fit-shape-to-text:t" inset="0,0,0,0">
@@ -2154,7 +2093,7 @@
                     </pic:cNvPicPr>
                   </pic:nvPicPr>
                   <pic:blipFill>
-                    <a:blip r:embed="rId15">
+                    <a:blip r:embed="rId18">
                       <a:extLst>
                         <a:ext uri="{28A0092B-C50C-407E-A947-70E740481C1C}">
                           <a14:useLocalDpi xmlns:a14="http://schemas.microsoft.com/office/drawing/2010/main" val="0"/>
@@ -2219,7 +2158,7 @@
                     </pic:cNvPicPr>
                   </pic:nvPicPr>
                   <pic:blipFill>
-                    <a:blip r:embed="rId16">
+                    <a:blip r:embed="rId19">
                       <a:extLst>
                         <a:ext uri="{28A0092B-C50C-407E-A947-70E740481C1C}">
                           <a14:useLocalDpi xmlns:a14="http://schemas.microsoft.com/office/drawing/2010/main" val="0"/>
@@ -2310,24 +2249,14 @@
         </w:tabs>
       </w:pPr>
       <w:r>
-        <w:rPr/>
+        <w:lastRenderedPageBreak/>
         <w:t xml:space="preserve">We can also control the chemical compound of an </w:t>
       </w:r>
       <w:r>
-        <w:rPr/>
         <w:t>analyte,</w:t>
       </w:r>
       <w:r>
-        <w:rPr/>
-        <w:t xml:space="preserve"> for example instead of reporting Na </w:t>
-      </w:r>
-      <w:r>
-        <w:rPr/>
-        <w:t>oxide</w:t>
-      </w:r>
-      <w:r>
-        <w:rPr/>
-        <w:t xml:space="preserve"> we can report Na sulfite by creating a sulfite list in the configuration file and adding Na.</w:t>
+        <w:t xml:space="preserve"> for example instead of reporting Na oxide we can report Na sulfite by creating a sulfite list in the configuration file and adding Na.</w:t>
       </w:r>
     </w:p>
     <w:p>
@@ -2359,7 +2288,7 @@
                     </pic:cNvPicPr>
                   </pic:nvPicPr>
                   <pic:blipFill>
-                    <a:blip r:embed="rId17">
+                    <a:blip r:embed="rId20">
                       <a:extLst>
                         <a:ext uri="{28A0092B-C50C-407E-A947-70E740481C1C}">
                           <a14:useLocalDpi xmlns:a14="http://schemas.microsoft.com/office/drawing/2010/main" val="0"/>
@@ -2443,7 +2372,7 @@
                     </pic:cNvPicPr>
                   </pic:nvPicPr>
                   <pic:blipFill>
-                    <a:blip r:embed="rId18">
+                    <a:blip r:embed="rId21">
                       <a:extLst>
                         <a:ext uri="{28A0092B-C50C-407E-A947-70E740481C1C}">
                           <a14:useLocalDpi xmlns:a14="http://schemas.microsoft.com/office/drawing/2010/main" val="0"/>
@@ -2517,139 +2446,99 @@
         </w:tabs>
       </w:pPr>
       <w:r>
-        <w:rPr/>
+        <w:lastRenderedPageBreak/>
         <w:t xml:space="preserve">Location </w:t>
       </w:r>
       <w:r>
-        <w:rPr/>
         <w:t>of</w:t>
       </w:r>
       <w:r>
-        <w:rPr/>
         <w:t xml:space="preserve"> </w:t>
       </w:r>
       <w:r>
-        <w:rPr/>
         <w:t xml:space="preserve">the </w:t>
       </w:r>
       <w:r>
-        <w:rPr/>
         <w:t>sav</w:t>
       </w:r>
       <w:r>
-        <w:rPr/>
         <w:t>ed</w:t>
       </w:r>
       <w:r>
-        <w:rPr/>
         <w:t xml:space="preserve"> </w:t>
       </w:r>
       <w:r>
         <w:rPr>
-          <w:i w:val="1"/>
-          <w:iCs w:val="1"/>
-        </w:rPr>
-        <w:t>master_woorkbook.xlsx</w:t>
-      </w:r>
-      <w:r>
-        <w:rPr>
-          <w:i w:val="1"/>
-          <w:iCs w:val="1"/>
-        </w:rPr>
-        <w:t xml:space="preserve"> </w:t>
-      </w:r>
-      <w:r>
-        <w:rPr/>
-        <w:t xml:space="preserve">is </w:t>
-      </w:r>
-      <w:r>
-        <w:rPr/>
-        <w:t xml:space="preserve">controlled by </w:t>
-      </w:r>
-      <w:r>
-        <w:rPr/>
+          <w:i/>
+          <w:iCs/>
+        </w:rPr>
+        <w:t xml:space="preserve">master_woorkbook.xlsx </w:t>
+      </w:r>
+      <w:r>
+        <w:t xml:space="preserve">is controlled by </w:t>
+      </w:r>
+      <w:r>
         <w:t xml:space="preserve">attaching a URL to </w:t>
       </w:r>
       <w:r>
-        <w:rPr/>
         <w:t>directory</w:t>
       </w:r>
       <w:r>
-        <w:rPr/>
         <w:t xml:space="preserve"> in the Path section of the configuration file.</w:t>
       </w:r>
       <w:r>
-        <w:rPr/>
         <w:t xml:space="preserve"> If </w:t>
       </w:r>
       <w:r>
-        <w:rPr/>
         <w:t xml:space="preserve">a </w:t>
       </w:r>
       <w:r>
-        <w:rPr/>
         <w:t xml:space="preserve">path is </w:t>
       </w:r>
       <w:r>
-        <w:rPr/>
         <w:t xml:space="preserve">not </w:t>
       </w:r>
       <w:r>
-        <w:rPr/>
         <w:t>provided,</w:t>
       </w:r>
       <w:r>
-        <w:rPr/>
         <w:t xml:space="preserve"> it defaults to directory that the program is running.</w:t>
       </w:r>
       <w:r>
-        <w:rPr/>
         <w:t xml:space="preserve"> Use &lt;F1&gt; as shortcut to open the </w:t>
       </w:r>
       <w:r>
         <w:rPr>
-          <w:i w:val="1"/>
-          <w:iCs w:val="1"/>
+          <w:i/>
+          <w:iCs/>
         </w:rPr>
         <w:t>config.ini</w:t>
       </w:r>
       <w:r>
-        <w:rPr/>
         <w:t xml:space="preserve"> configuration file.</w:t>
       </w:r>
       <w:r>
-        <w:rPr/>
         <w:t xml:space="preserve"> The </w:t>
       </w:r>
       <w:r>
         <w:rPr>
-          <w:i w:val="1"/>
-          <w:iCs w:val="1"/>
+          <w:i/>
+          <w:iCs/>
         </w:rPr>
         <w:t>lot.csv</w:t>
       </w:r>
       <w:r>
-        <w:rPr/>
-        <w:t xml:space="preserve"> file is </w:t>
-      </w:r>
-      <w:r>
-        <w:rPr/>
-        <w:t>maintained</w:t>
-      </w:r>
-      <w:r>
-        <w:rPr/>
-        <w:t xml:space="preserve"> as a csv file that can be open with a text editor or excel.</w:t>
-      </w:r>
-      <w:r>
-        <w:rPr/>
+        <w:t xml:space="preserve"> file is maintained as a csv file that can be open with a text editor or excel.</w:t>
+      </w:r>
+      <w:r>
         <w:t xml:space="preserve"> Expiration dates should be formatted as such: Month date </w:t>
       </w:r>
-      <w:r>
-        <w:rPr/>
+      <w:proofErr w:type="spellStart"/>
+      <w:r>
         <w:t>yyyy</w:t>
       </w:r>
-      <w:r>
-        <w:rPr/>
+      <w:proofErr w:type="spellEnd"/>
+      <w:r>
         <w:t>, month can be full form or abbreviated.</w:t>
       </w:r>
     </w:p>
@@ -2661,8 +2550,8 @@
       </w:pPr>
     </w:p>
     <w:sectPr>
-      <w:headerReference w:type="default" r:id="rId19"/>
-      <w:pgSz w:w="12240" w:h="15840" w:orient="portrait"/>
+      <w:headerReference w:type="default" r:id="rId22"/>
+      <w:pgSz w:w="12240" w:h="15840"/>
       <w:pgMar w:top="1440" w:right="1440" w:bottom="1440" w:left="1440" w:header="720" w:footer="720" w:gutter="0"/>
       <w:cols w:space="720"/>
       <w:docGrid w:linePitch="360"/>
@@ -2731,13 +2620,13 @@
       <w:t>Carl Archemetre</w:t>
     </w:r>
     <w:r>
-      <w:ptab w:alignment="center" w:relativeTo="margin" w:leader="none"/>
+      <w:ptab w:relativeTo="margin" w:alignment="center" w:leader="none"/>
     </w:r>
     <w:r>
       <w:t>Material Characterization</w:t>
     </w:r>
     <w:r>
-      <w:ptab w:alignment="right" w:relativeTo="margin" w:leader="none"/>
+      <w:ptab w:relativeTo="margin" w:alignment="right" w:leader="none"/>
     </w:r>
     <w:r>
       <w:t>May 27, 2026</w:t>
@@ -2751,7 +2640,7 @@
   <w:docDefaults>
     <w:rPrDefault>
       <w:rPr>
-        <w:rFonts w:asciiTheme="minorHAnsi" w:hAnsiTheme="minorHAnsi" w:eastAsiaTheme="minorHAnsi" w:cstheme="minorBidi"/>
+        <w:rFonts w:asciiTheme="minorHAnsi" w:eastAsiaTheme="minorHAnsi" w:hAnsiTheme="minorHAnsi" w:cstheme="minorBidi"/>
         <w:kern w:val="2"/>
         <w:sz w:val="24"/>
         <w:szCs w:val="24"/>
@@ -2768,14 +2657,14 @@
   <w:latentStyles w:defLockedState="0" w:defUIPriority="99" w:defSemiHidden="0" w:defUnhideWhenUsed="0" w:defQFormat="0" w:count="376">
     <w:lsdException w:name="Normal" w:uiPriority="0" w:qFormat="1"/>
     <w:lsdException w:name="heading 1" w:uiPriority="9" w:qFormat="1"/>
-    <w:lsdException w:name="heading 2" w:uiPriority="9" w:semiHidden="1" w:unhideWhenUsed="1" w:qFormat="1"/>
-    <w:lsdException w:name="heading 3" w:uiPriority="9" w:semiHidden="1" w:unhideWhenUsed="1" w:qFormat="1"/>
-    <w:lsdException w:name="heading 4" w:uiPriority="9" w:semiHidden="1" w:unhideWhenUsed="1" w:qFormat="1"/>
-    <w:lsdException w:name="heading 5" w:uiPriority="9" w:semiHidden="1" w:unhideWhenUsed="1" w:qFormat="1"/>
-    <w:lsdException w:name="heading 6" w:uiPriority="9" w:semiHidden="1" w:unhideWhenUsed="1" w:qFormat="1"/>
-    <w:lsdException w:name="heading 7" w:uiPriority="9" w:semiHidden="1" w:unhideWhenUsed="1" w:qFormat="1"/>
-    <w:lsdException w:name="heading 8" w:uiPriority="9" w:semiHidden="1" w:unhideWhenUsed="1" w:qFormat="1"/>
-    <w:lsdException w:name="heading 9" w:uiPriority="9" w:semiHidden="1" w:unhideWhenUsed="1" w:qFormat="1"/>
+    <w:lsdException w:name="heading 2" w:semiHidden="1" w:uiPriority="9" w:unhideWhenUsed="1" w:qFormat="1"/>
+    <w:lsdException w:name="heading 3" w:semiHidden="1" w:uiPriority="9" w:unhideWhenUsed="1" w:qFormat="1"/>
+    <w:lsdException w:name="heading 4" w:semiHidden="1" w:uiPriority="9" w:unhideWhenUsed="1" w:qFormat="1"/>
+    <w:lsdException w:name="heading 5" w:semiHidden="1" w:uiPriority="9" w:unhideWhenUsed="1" w:qFormat="1"/>
+    <w:lsdException w:name="heading 6" w:semiHidden="1" w:uiPriority="9" w:unhideWhenUsed="1" w:qFormat="1"/>
+    <w:lsdException w:name="heading 7" w:semiHidden="1" w:uiPriority="9" w:unhideWhenUsed="1" w:qFormat="1"/>
+    <w:lsdException w:name="heading 8" w:semiHidden="1" w:uiPriority="9" w:unhideWhenUsed="1" w:qFormat="1"/>
+    <w:lsdException w:name="heading 9" w:semiHidden="1" w:uiPriority="9" w:unhideWhenUsed="1" w:qFormat="1"/>
     <w:lsdException w:name="index 1" w:semiHidden="1" w:unhideWhenUsed="1"/>
     <w:lsdException w:name="index 2" w:semiHidden="1" w:unhideWhenUsed="1"/>
     <w:lsdException w:name="index 3" w:semiHidden="1" w:unhideWhenUsed="1"/>
@@ -2785,22 +2674,22 @@
     <w:lsdException w:name="index 7" w:semiHidden="1" w:unhideWhenUsed="1"/>
     <w:lsdException w:name="index 8" w:semiHidden="1" w:unhideWhenUsed="1"/>
     <w:lsdException w:name="index 9" w:semiHidden="1" w:unhideWhenUsed="1"/>
-    <w:lsdException w:name="toc 1" w:uiPriority="39" w:semiHidden="1" w:unhideWhenUsed="1"/>
-    <w:lsdException w:name="toc 2" w:uiPriority="39" w:semiHidden="1" w:unhideWhenUsed="1"/>
-    <w:lsdException w:name="toc 3" w:uiPriority="39" w:semiHidden="1" w:unhideWhenUsed="1"/>
-    <w:lsdException w:name="toc 4" w:uiPriority="39" w:semiHidden="1" w:unhideWhenUsed="1"/>
-    <w:lsdException w:name="toc 5" w:uiPriority="39" w:semiHidden="1" w:unhideWhenUsed="1"/>
-    <w:lsdException w:name="toc 6" w:uiPriority="39" w:semiHidden="1" w:unhideWhenUsed="1"/>
-    <w:lsdException w:name="toc 7" w:uiPriority="39" w:semiHidden="1" w:unhideWhenUsed="1"/>
-    <w:lsdException w:name="toc 8" w:uiPriority="39" w:semiHidden="1" w:unhideWhenUsed="1"/>
-    <w:lsdException w:name="toc 9" w:uiPriority="39" w:semiHidden="1" w:unhideWhenUsed="1"/>
+    <w:lsdException w:name="toc 1" w:semiHidden="1" w:uiPriority="39" w:unhideWhenUsed="1"/>
+    <w:lsdException w:name="toc 2" w:semiHidden="1" w:uiPriority="39" w:unhideWhenUsed="1"/>
+    <w:lsdException w:name="toc 3" w:semiHidden="1" w:uiPriority="39" w:unhideWhenUsed="1"/>
+    <w:lsdException w:name="toc 4" w:semiHidden="1" w:uiPriority="39" w:unhideWhenUsed="1"/>
+    <w:lsdException w:name="toc 5" w:semiHidden="1" w:uiPriority="39" w:unhideWhenUsed="1"/>
+    <w:lsdException w:name="toc 6" w:semiHidden="1" w:uiPriority="39" w:unhideWhenUsed="1"/>
+    <w:lsdException w:name="toc 7" w:semiHidden="1" w:uiPriority="39" w:unhideWhenUsed="1"/>
+    <w:lsdException w:name="toc 8" w:semiHidden="1" w:uiPriority="39" w:unhideWhenUsed="1"/>
+    <w:lsdException w:name="toc 9" w:semiHidden="1" w:uiPriority="39" w:unhideWhenUsed="1"/>
     <w:lsdException w:name="Normal Indent" w:semiHidden="1" w:unhideWhenUsed="1"/>
     <w:lsdException w:name="footnote text" w:semiHidden="1" w:unhideWhenUsed="1"/>
     <w:lsdException w:name="annotation text" w:semiHidden="1" w:unhideWhenUsed="1"/>
     <w:lsdException w:name="header" w:semiHidden="1" w:unhideWhenUsed="1"/>
     <w:lsdException w:name="footer" w:semiHidden="1" w:unhideWhenUsed="1"/>
     <w:lsdException w:name="index heading" w:semiHidden="1" w:unhideWhenUsed="1"/>
-    <w:lsdException w:name="caption" w:uiPriority="35" w:semiHidden="1" w:unhideWhenUsed="1" w:qFormat="1"/>
+    <w:lsdException w:name="caption" w:semiHidden="1" w:uiPriority="35" w:unhideWhenUsed="1" w:qFormat="1"/>
     <w:lsdException w:name="table of figures" w:semiHidden="1" w:unhideWhenUsed="1"/>
     <w:lsdException w:name="envelope address" w:semiHidden="1" w:unhideWhenUsed="1"/>
     <w:lsdException w:name="envelope return" w:semiHidden="1" w:unhideWhenUsed="1"/>
@@ -2831,7 +2720,7 @@
     <w:lsdException w:name="Title" w:uiPriority="10" w:qFormat="1"/>
     <w:lsdException w:name="Closing" w:semiHidden="1" w:unhideWhenUsed="1"/>
     <w:lsdException w:name="Signature" w:semiHidden="1" w:unhideWhenUsed="1"/>
-    <w:lsdException w:name="Default Paragraph Font" w:uiPriority="1" w:semiHidden="1" w:unhideWhenUsed="1"/>
+    <w:lsdException w:name="Default Paragraph Font" w:semiHidden="1" w:uiPriority="1" w:unhideWhenUsed="1"/>
     <w:lsdException w:name="Body Text" w:semiHidden="1" w:unhideWhenUsed="1"/>
     <w:lsdException w:name="Body Text Indent" w:semiHidden="1" w:unhideWhenUsed="1"/>
     <w:lsdException w:name="List Continue" w:semiHidden="1" w:unhideWhenUsed="1"/>
@@ -3031,8 +2920,8 @@
     <w:lsdException w:name="Subtle Reference" w:uiPriority="31" w:qFormat="1"/>
     <w:lsdException w:name="Intense Reference" w:uiPriority="32" w:qFormat="1"/>
     <w:lsdException w:name="Book Title" w:uiPriority="33" w:qFormat="1"/>
-    <w:lsdException w:name="Bibliography" w:uiPriority="37" w:semiHidden="1" w:unhideWhenUsed="1"/>
-    <w:lsdException w:name="TOC Heading" w:uiPriority="39" w:semiHidden="1" w:unhideWhenUsed="1" w:qFormat="1"/>
+    <w:lsdException w:name="Bibliography" w:semiHidden="1" w:uiPriority="37" w:unhideWhenUsed="1"/>
+    <w:lsdException w:name="TOC Heading" w:semiHidden="1" w:uiPriority="39" w:unhideWhenUsed="1" w:qFormat="1"/>
     <w:lsdException w:name="Plain Table 1" w:uiPriority="41"/>
     <w:lsdException w:name="Plain Table 2" w:uiPriority="42"/>
     <w:lsdException w:name="Plain Table 3" w:uiPriority="43"/>
@@ -3143,7 +3032,7 @@
     <w:lsdException w:name="Unresolved Mention" w:semiHidden="1" w:unhideWhenUsed="1"/>
     <w:lsdException w:name="Smart Link" w:semiHidden="1" w:unhideWhenUsed="1"/>
   </w:latentStyles>
-  <w:style w:type="paragraph" w:styleId="Normal" w:default="1">
+  <w:style w:type="paragraph" w:default="1" w:styleId="Normal">
     <w:name w:val="Normal"/>
     <w:qFormat/>
   </w:style>
@@ -3162,7 +3051,7 @@
       <w:outlineLvl w:val="0"/>
     </w:pPr>
     <w:rPr>
-      <w:rFonts w:asciiTheme="majorHAnsi" w:hAnsiTheme="majorHAnsi" w:eastAsiaTheme="majorEastAsia" w:cstheme="majorBidi"/>
+      <w:rFonts w:asciiTheme="majorHAnsi" w:eastAsiaTheme="majorEastAsia" w:hAnsiTheme="majorHAnsi" w:cstheme="majorBidi"/>
       <w:color w:val="0F4761" w:themeColor="accent1" w:themeShade="BF"/>
       <w:sz w:val="40"/>
       <w:szCs w:val="40"/>
@@ -3185,7 +3074,7 @@
       <w:outlineLvl w:val="1"/>
     </w:pPr>
     <w:rPr>
-      <w:rFonts w:asciiTheme="majorHAnsi" w:hAnsiTheme="majorHAnsi" w:eastAsiaTheme="majorEastAsia" w:cstheme="majorBidi"/>
+      <w:rFonts w:asciiTheme="majorHAnsi" w:eastAsiaTheme="majorEastAsia" w:hAnsiTheme="majorHAnsi" w:cstheme="majorBidi"/>
       <w:color w:val="0F4761" w:themeColor="accent1" w:themeShade="BF"/>
       <w:sz w:val="32"/>
       <w:szCs w:val="32"/>
@@ -3346,13 +3235,13 @@
       <w:color w:val="272727" w:themeColor="text1" w:themeTint="D8"/>
     </w:rPr>
   </w:style>
-  <w:style w:type="character" w:styleId="DefaultParagraphFont" w:default="1">
+  <w:style w:type="character" w:default="1" w:styleId="DefaultParagraphFont">
     <w:name w:val="Default Paragraph Font"/>
     <w:uiPriority w:val="1"/>
     <w:semiHidden/>
     <w:unhideWhenUsed/>
   </w:style>
-  <w:style w:type="table" w:styleId="TableNormal" w:default="1">
+  <w:style w:type="table" w:default="1" w:styleId="TableNormal">
     <w:name w:val="Normal Table"/>
     <w:uiPriority w:val="99"/>
     <w:semiHidden/>
@@ -3367,26 +3256,26 @@
       </w:tblCellMar>
     </w:tblPr>
   </w:style>
-  <w:style w:type="numbering" w:styleId="NoList" w:default="1">
+  <w:style w:type="numbering" w:default="1" w:styleId="NoList">
     <w:name w:val="No List"/>
     <w:uiPriority w:val="99"/>
     <w:semiHidden/>
     <w:unhideWhenUsed/>
   </w:style>
-  <w:style w:type="character" w:styleId="Heading1Char" w:customStyle="1">
+  <w:style w:type="character" w:customStyle="1" w:styleId="Heading1Char">
     <w:name w:val="Heading 1 Char"/>
     <w:basedOn w:val="DefaultParagraphFont"/>
     <w:link w:val="Heading1"/>
     <w:uiPriority w:val="9"/>
     <w:rsid w:val="007C3E05"/>
     <w:rPr>
-      <w:rFonts w:asciiTheme="majorHAnsi" w:hAnsiTheme="majorHAnsi" w:eastAsiaTheme="majorEastAsia" w:cstheme="majorBidi"/>
+      <w:rFonts w:asciiTheme="majorHAnsi" w:eastAsiaTheme="majorEastAsia" w:hAnsiTheme="majorHAnsi" w:cstheme="majorBidi"/>
       <w:color w:val="0F4761" w:themeColor="accent1" w:themeShade="BF"/>
       <w:sz w:val="40"/>
       <w:szCs w:val="40"/>
     </w:rPr>
   </w:style>
-  <w:style w:type="character" w:styleId="Heading2Char" w:customStyle="1">
+  <w:style w:type="character" w:customStyle="1" w:styleId="Heading2Char">
     <w:name w:val="Heading 2 Char"/>
     <w:basedOn w:val="DefaultParagraphFont"/>
     <w:link w:val="Heading2"/>
@@ -3394,13 +3283,13 @@
     <w:semiHidden/>
     <w:rsid w:val="007C3E05"/>
     <w:rPr>
-      <w:rFonts w:asciiTheme="majorHAnsi" w:hAnsiTheme="majorHAnsi" w:eastAsiaTheme="majorEastAsia" w:cstheme="majorBidi"/>
+      <w:rFonts w:asciiTheme="majorHAnsi" w:eastAsiaTheme="majorEastAsia" w:hAnsiTheme="majorHAnsi" w:cstheme="majorBidi"/>
       <w:color w:val="0F4761" w:themeColor="accent1" w:themeShade="BF"/>
       <w:sz w:val="32"/>
       <w:szCs w:val="32"/>
     </w:rPr>
   </w:style>
-  <w:style w:type="character" w:styleId="Heading3Char" w:customStyle="1">
+  <w:style w:type="character" w:customStyle="1" w:styleId="Heading3Char">
     <w:name w:val="Heading 3 Char"/>
     <w:basedOn w:val="DefaultParagraphFont"/>
     <w:link w:val="Heading3"/>
@@ -3414,7 +3303,7 @@
       <w:szCs w:val="28"/>
     </w:rPr>
   </w:style>
-  <w:style w:type="character" w:styleId="Heading4Char" w:customStyle="1">
+  <w:style w:type="character" w:customStyle="1" w:styleId="Heading4Char">
     <w:name w:val="Heading 4 Char"/>
     <w:basedOn w:val="DefaultParagraphFont"/>
     <w:link w:val="Heading4"/>
@@ -3428,7 +3317,7 @@
       <w:color w:val="0F4761" w:themeColor="accent1" w:themeShade="BF"/>
     </w:rPr>
   </w:style>
-  <w:style w:type="character" w:styleId="Heading5Char" w:customStyle="1">
+  <w:style w:type="character" w:customStyle="1" w:styleId="Heading5Char">
     <w:name w:val="Heading 5 Char"/>
     <w:basedOn w:val="DefaultParagraphFont"/>
     <w:link w:val="Heading5"/>
@@ -3440,7 +3329,7 @@
       <w:color w:val="0F4761" w:themeColor="accent1" w:themeShade="BF"/>
     </w:rPr>
   </w:style>
-  <w:style w:type="character" w:styleId="Heading6Char" w:customStyle="1">
+  <w:style w:type="character" w:customStyle="1" w:styleId="Heading6Char">
     <w:name w:val="Heading 6 Char"/>
     <w:basedOn w:val="DefaultParagraphFont"/>
     <w:link w:val="Heading6"/>
@@ -3454,7 +3343,7 @@
       <w:color w:val="595959" w:themeColor="text1" w:themeTint="A6"/>
     </w:rPr>
   </w:style>
-  <w:style w:type="character" w:styleId="Heading7Char" w:customStyle="1">
+  <w:style w:type="character" w:customStyle="1" w:styleId="Heading7Char">
     <w:name w:val="Heading 7 Char"/>
     <w:basedOn w:val="DefaultParagraphFont"/>
     <w:link w:val="Heading7"/>
@@ -3466,7 +3355,7 @@
       <w:color w:val="595959" w:themeColor="text1" w:themeTint="A6"/>
     </w:rPr>
   </w:style>
-  <w:style w:type="character" w:styleId="Heading8Char" w:customStyle="1">
+  <w:style w:type="character" w:customStyle="1" w:styleId="Heading8Char">
     <w:name w:val="Heading 8 Char"/>
     <w:basedOn w:val="DefaultParagraphFont"/>
     <w:link w:val="Heading8"/>
@@ -3480,7 +3369,7 @@
       <w:color w:val="272727" w:themeColor="text1" w:themeTint="D8"/>
     </w:rPr>
   </w:style>
-  <w:style w:type="character" w:styleId="Heading9Char" w:customStyle="1">
+  <w:style w:type="character" w:customStyle="1" w:styleId="Heading9Char">
     <w:name w:val="Heading 9 Char"/>
     <w:basedOn w:val="DefaultParagraphFont"/>
     <w:link w:val="Heading9"/>
@@ -3505,21 +3394,21 @@
       <w:contextualSpacing/>
     </w:pPr>
     <w:rPr>
-      <w:rFonts w:asciiTheme="majorHAnsi" w:hAnsiTheme="majorHAnsi" w:eastAsiaTheme="majorEastAsia" w:cstheme="majorBidi"/>
+      <w:rFonts w:asciiTheme="majorHAnsi" w:eastAsiaTheme="majorEastAsia" w:hAnsiTheme="majorHAnsi" w:cstheme="majorBidi"/>
       <w:spacing w:val="-10"/>
       <w:kern w:val="28"/>
       <w:sz w:val="56"/>
       <w:szCs w:val="56"/>
     </w:rPr>
   </w:style>
-  <w:style w:type="character" w:styleId="TitleChar" w:customStyle="1">
+  <w:style w:type="character" w:customStyle="1" w:styleId="TitleChar">
     <w:name w:val="Title Char"/>
     <w:basedOn w:val="DefaultParagraphFont"/>
     <w:link w:val="Title"/>
     <w:uiPriority w:val="10"/>
     <w:rsid w:val="007C3E05"/>
     <w:rPr>
-      <w:rFonts w:asciiTheme="majorHAnsi" w:hAnsiTheme="majorHAnsi" w:eastAsiaTheme="majorEastAsia" w:cstheme="majorBidi"/>
+      <w:rFonts w:asciiTheme="majorHAnsi" w:eastAsiaTheme="majorEastAsia" w:hAnsiTheme="majorHAnsi" w:cstheme="majorBidi"/>
       <w:spacing w:val="-10"/>
       <w:kern w:val="28"/>
       <w:sz w:val="56"/>
@@ -3547,7 +3436,7 @@
       <w:szCs w:val="28"/>
     </w:rPr>
   </w:style>
-  <w:style w:type="character" w:styleId="SubtitleChar" w:customStyle="1">
+  <w:style w:type="character" w:customStyle="1" w:styleId="SubtitleChar">
     <w:name w:val="Subtitle Char"/>
     <w:basedOn w:val="DefaultParagraphFont"/>
     <w:link w:val="Subtitle"/>
@@ -3579,7 +3468,7 @@
       <w:color w:val="404040" w:themeColor="text1" w:themeTint="BF"/>
     </w:rPr>
   </w:style>
-  <w:style w:type="character" w:styleId="QuoteChar" w:customStyle="1">
+  <w:style w:type="character" w:customStyle="1" w:styleId="QuoteChar">
     <w:name w:val="Quote Char"/>
     <w:basedOn w:val="DefaultParagraphFont"/>
     <w:link w:val="Quote"/>
@@ -3624,8 +3513,8 @@
     <w:rsid w:val="007C3E05"/>
     <w:pPr>
       <w:pBdr>
-        <w:top w:val="single" w:color="0F4761" w:themeColor="accent1" w:themeShade="BF" w:sz="4" w:space="10"/>
-        <w:bottom w:val="single" w:color="0F4761" w:themeColor="accent1" w:themeShade="BF" w:sz="4" w:space="10"/>
+        <w:top w:val="single" w:sz="4" w:space="10" w:color="0F4761" w:themeColor="accent1" w:themeShade="BF"/>
+        <w:bottom w:val="single" w:sz="4" w:space="10" w:color="0F4761" w:themeColor="accent1" w:themeShade="BF"/>
       </w:pBdr>
       <w:spacing w:before="360" w:after="360"/>
       <w:ind w:left="864" w:right="864"/>
@@ -3637,7 +3526,7 @@
       <w:color w:val="0F4761" w:themeColor="accent1" w:themeShade="BF"/>
     </w:rPr>
   </w:style>
-  <w:style w:type="character" w:styleId="IntenseQuoteChar" w:customStyle="1">
+  <w:style w:type="character" w:customStyle="1" w:styleId="IntenseQuoteChar">
     <w:name w:val="Intense Quote Char"/>
     <w:basedOn w:val="DefaultParagraphFont"/>
     <w:link w:val="IntenseQuote"/>
@@ -3678,7 +3567,7 @@
       <w:spacing w:after="0" w:line="240" w:lineRule="auto"/>
     </w:pPr>
   </w:style>
-  <w:style w:type="character" w:styleId="HeaderChar" w:customStyle="1">
+  <w:style w:type="character" w:customStyle="1" w:styleId="HeaderChar">
     <w:name w:val="Header Char"/>
     <w:basedOn w:val="DefaultParagraphFont"/>
     <w:link w:val="Header"/>
@@ -3700,7 +3589,7 @@
       <w:spacing w:after="0" w:line="240" w:lineRule="auto"/>
     </w:pPr>
   </w:style>
-  <w:style w:type="character" w:styleId="FooterChar" w:customStyle="1">
+  <w:style w:type="character" w:customStyle="1" w:styleId="FooterChar">
     <w:name w:val="Footer Char"/>
     <w:basedOn w:val="DefaultParagraphFont"/>
     <w:link w:val="Footer"/>
@@ -3730,7 +3619,7 @@
 </file>
 
 <file path=word/theme/theme1.xml><?xml version="1.0" encoding="utf-8"?>
-<a:theme xmlns:a="http://schemas.openxmlformats.org/drawingml/2006/main" xmlns:thm15="http://schemas.microsoft.com/office/thememl/2012/main" name="Office Theme">
+<a:theme xmlns:a="http://schemas.openxmlformats.org/drawingml/2006/main" name="Office Theme">
   <a:themeElements>
     <a:clrScheme name="Office">
       <a:dk1>
@@ -4045,6 +3934,15 @@
 </file>
 
 <file path=customXml/item1.xml><?xml version="1.0" encoding="utf-8"?>
+<?mso-contentType ?>
+<FormTemplates xmlns="http://schemas.microsoft.com/sharepoint/v3/contenttype/forms">
+  <Display>DocumentLibraryForm</Display>
+  <Edit>DocumentLibraryForm</Edit>
+  <New>DocumentLibraryForm</New>
+</FormTemplates>
+</file>
+
+<file path=customXml/item2.xml><?xml version="1.0" encoding="utf-8"?>
 <ct:contentTypeSchema xmlns:ct="http://schemas.microsoft.com/office/2006/metadata/contentType" xmlns:ma="http://schemas.microsoft.com/office/2006/metadata/properties/metaAttributes" ct:_="" ma:_="" ma:contentTypeName="Document" ma:contentTypeID="0x0101004CBC8261071EE84099EB6C95137F5AB8" ma:contentTypeVersion="19" ma:contentTypeDescription="Create a new document." ma:contentTypeScope="" ma:versionID="4637ae707e710fe4318e646ac5c93b46">
   <xsd:schema xmlns:xsd="http://www.w3.org/2001/XMLSchema" xmlns:xs="http://www.w3.org/2001/XMLSchema" xmlns:p="http://schemas.microsoft.com/office/2006/metadata/properties" xmlns:ns2="0fc475c1-99c8-4a27-b640-1b405f183953" xmlns:ns3="23ce4f88-cd98-46c7-a231-3c68dd29b0d7" targetNamespace="http://schemas.microsoft.com/office/2006/metadata/properties" ma:root="true" ma:fieldsID="1056b3aed422a163a2baf6ce204e82e4" ns2:_="" ns3:_="">
     <xsd:import namespace="0fc475c1-99c8-4a27-b640-1b405f183953"/>
@@ -4305,15 +4203,6 @@
 </ct:contentTypeSchema>
 </file>
 
-<file path=customXml/item2.xml><?xml version="1.0" encoding="utf-8"?>
-<?mso-contentType ?>
-<FormTemplates xmlns="http://schemas.microsoft.com/sharepoint/v3/contenttype/forms">
-  <Display>DocumentLibraryForm</Display>
-  <Edit>DocumentLibraryForm</Edit>
-  <New>DocumentLibraryForm</New>
-</FormTemplates>
-</file>
-
 <file path=customXml/item3.xml><?xml version="1.0" encoding="utf-8"?>
 <p:properties xmlns:p="http://schemas.microsoft.com/office/2006/metadata/properties" xmlns:xsi="http://www.w3.org/2001/XMLSchema-instance" xmlns:pc="http://schemas.microsoft.com/office/infopath/2007/PartnerControls">
   <documentManagement>
@@ -4326,13 +4215,39 @@
 </file>
 
 <file path=customXml/itemProps1.xml><?xml version="1.0" encoding="utf-8"?>
-<ds:datastoreItem xmlns:ds="http://schemas.openxmlformats.org/officeDocument/2006/customXml" ds:itemID="{B8C83D53-9E04-4522-BC25-9ABD5EB71A1C}"/>
+<ds:datastoreItem xmlns:ds="http://schemas.openxmlformats.org/officeDocument/2006/customXml" ds:itemID="{8D5B6878-469A-4B60-998B-9702BD32B9BE}">
+  <ds:schemaRefs>
+    <ds:schemaRef ds:uri="http://schemas.microsoft.com/sharepoint/v3/contenttype/forms"/>
+  </ds:schemaRefs>
+</ds:datastoreItem>
 </file>
 
 <file path=customXml/itemProps2.xml><?xml version="1.0" encoding="utf-8"?>
-<ds:datastoreItem xmlns:ds="http://schemas.openxmlformats.org/officeDocument/2006/customXml" ds:itemID="{8D5B6878-469A-4B60-998B-9702BD32B9BE}"/>
+<ds:datastoreItem xmlns:ds="http://schemas.openxmlformats.org/officeDocument/2006/customXml" ds:itemID="{B8C83D53-9E04-4522-BC25-9ABD5EB71A1C}">
+  <ds:schemaRefs>
+    <ds:schemaRef ds:uri="http://schemas.microsoft.com/office/2006/metadata/contentType"/>
+    <ds:schemaRef ds:uri="http://schemas.microsoft.com/office/2006/metadata/properties/metaAttributes"/>
+    <ds:schemaRef ds:uri="http://www.w3.org/2001/XMLSchema"/>
+    <ds:schemaRef ds:uri="http://schemas.microsoft.com/office/2006/metadata/properties"/>
+    <ds:schemaRef ds:uri="0fc475c1-99c8-4a27-b640-1b405f183953"/>
+    <ds:schemaRef ds:uri="23ce4f88-cd98-46c7-a231-3c68dd29b0d7"/>
+    <ds:schemaRef ds:uri="http://schemas.microsoft.com/office/2006/documentManagement/types"/>
+    <ds:schemaRef ds:uri="http://schemas.microsoft.com/office/infopath/2007/PartnerControls"/>
+    <ds:schemaRef ds:uri="http://schemas.openxmlformats.org/package/2006/metadata/core-properties"/>
+    <ds:schemaRef ds:uri="http://purl.org/dc/elements/1.1/"/>
+    <ds:schemaRef ds:uri="http://purl.org/dc/terms/"/>
+    <ds:schemaRef ds:uri="http://schemas.microsoft.com/internal/obd"/>
+  </ds:schemaRefs>
+</ds:datastoreItem>
 </file>
 
 <file path=customXml/itemProps3.xml><?xml version="1.0" encoding="utf-8"?>
-<ds:datastoreItem xmlns:ds="http://schemas.openxmlformats.org/officeDocument/2006/customXml" ds:itemID="{439C65E3-FBD4-42DD-A22B-C05F66E5A302}"/>
+<ds:datastoreItem xmlns:ds="http://schemas.openxmlformats.org/officeDocument/2006/customXml" ds:itemID="{439C65E3-FBD4-42DD-A22B-C05F66E5A302}">
+  <ds:schemaRefs>
+    <ds:schemaRef ds:uri="http://schemas.microsoft.com/office/2006/metadata/properties"/>
+    <ds:schemaRef ds:uri="http://schemas.microsoft.com/office/infopath/2007/PartnerControls"/>
+    <ds:schemaRef ds:uri="0fc475c1-99c8-4a27-b640-1b405f183953"/>
+    <ds:schemaRef ds:uri="23ce4f88-cd98-46c7-a231-3c68dd29b0d7"/>
+  </ds:schemaRefs>
+</ds:datastoreItem>
 </file>
</xml_diff>